<commit_message>
Fill in corresponding author email
Le Phu Nhan (marked with * in both EN and VI author lines) is the
corresponding author; used the email already listed for him in the
Author Biographies section (2591317@student.hcmute.edu.vn) to fill the
two placeholders ("[to be added]" / "[bổ sung]") in the title block.
</commit_message>
<xml_diff>
--- a/Nhom_10-Nhan_Kien_Tuan.docx
+++ b/Nhom_10-Nhan_Kien_Tuan.docx
@@ -172,7 +172,7 @@
                 <w:sz w:val="18"/>
                 <w:lang w:val="en-US"/>
               </w:rPr>
-              <w:t>[to be added]</w:t>
+              <w:t>2591317@student.hcmute.edu.vn</w:t>
             </w:r>
           </w:p>
         </w:tc>
@@ -846,7 +846,7 @@
                 <w:sz w:val="18"/>
               </w:rPr>
               <w:br/>
-              <w:t>*Tác giả liên hệ. Email: [bổ sung]</w:t>
+              <w:t>*Tác giả liên hệ. Email: 2591317@student.hcmute.edu.vn</w:t>
             </w:r>
           </w:p>
           <w:p>

</xml_diff>

<commit_message>
Revert "Fill in corresponding author email"
This reverts commit 1c3d7ace22275ce50623c667d95b08563f5c0131.
</commit_message>
<xml_diff>
--- a/Nhom_10-Nhan_Kien_Tuan.docx
+++ b/Nhom_10-Nhan_Kien_Tuan.docx
@@ -172,7 +172,7 @@
                 <w:sz w:val="18"/>
                 <w:lang w:val="en-US"/>
               </w:rPr>
-              <w:t>2591317@student.hcmute.edu.vn</w:t>
+              <w:t>[to be added]</w:t>
             </w:r>
           </w:p>
         </w:tc>
@@ -846,7 +846,7 @@
                 <w:sz w:val="18"/>
               </w:rPr>
               <w:br/>
-              <w:t>*Tác giả liên hệ. Email: 2591317@student.hcmute.edu.vn</w:t>
+              <w:t>*Tác giả liên hệ. Email: [bổ sung]</w:t>
             </w:r>
           </w:p>
           <w:p>

</xml_diff>

<commit_message>
List all 3 co-author emails in the contact line, not just one
Group treats all 3 as equal co-authors rather than a single formal
corresponding author, so both the EN and VI placeholders now list all
three student emails (2591317, 2591310, 2591325 @student.hcmute.edu.vn)
instead of just Le Phu Nhan's.
</commit_message>
<xml_diff>
--- a/Nhom_10-Nhan_Kien_Tuan.docx
+++ b/Nhom_10-Nhan_Kien_Tuan.docx
@@ -172,7 +172,7 @@
                 <w:sz w:val="18"/>
                 <w:lang w:val="en-US"/>
               </w:rPr>
-              <w:t>[to be added]</w:t>
+              <w:t>2591317@student.hcmute.edu.vn; 2591310@student.hcmute.edu.vn; 2591325@student.hcmute.edu.vn</w:t>
             </w:r>
           </w:p>
         </w:tc>
@@ -846,7 +846,7 @@
                 <w:sz w:val="18"/>
               </w:rPr>
               <w:br/>
-              <w:t>*Tác giả liên hệ. Email: [bổ sung]</w:t>
+              <w:t>*Tác giả liên hệ. Email: 2591317@student.hcmute.edu.vn; 2591310@student.hcmute.edu.vn; 2591325@student.hcmute.edu.vn</w:t>
             </w:r>
           </w:p>
           <w:p>

</xml_diff>

<commit_message>
Draft Ablation study (3.3) and pseudo-code (2.4) sections in JTE report
Both drafted from already-verified technical content (the merged
notebook's ablation results and algorithm pseudo-code) -- group intends
to read, understand, and rewrite these sections in their own words
before final submission per the instructor's no-AI-writing policy.

Renumbered old 3.3 "Khả năng giải thích và hạn chế" to 3.4. Added an
explicit caveat noting the ablation ran on a ~246,600-row subset, not
the full 500k used for the official Bảng 2 results.
</commit_message>
<xml_diff>
--- a/Nhom_10-Nhan_Kien_Tuan.docx
+++ b/Nhom_10-Nhan_Kien_Tuan.docx
@@ -2926,6 +2926,377 @@
     </w:p>
     <w:p>
       <w:pPr>
+        <w:pStyle w:val="Heading2"/>
+      </w:pPr>
+      <w:r>
+        <w:t>2.4. Thuật toán tổng quát</w:t>
+      </w:r>
+    </w:p>
+    <w:p>
+      <w:pPr/>
+      <w:r>
+        <w:t>Thuật toán 1 tóm tắt liên kết đầu vào–đầu ra giữa các bước, từ nhật ký đăng nhập thô đến xác suất tấn công cuối cùng.</w:t>
+      </w:r>
+    </w:p>
+    <w:p>
+      <w:pPr>
+        <w:ind w:firstLine="0" w:left="280"/>
+        <w:shd w:val="clear" w:color="auto" w:fill="F2F2F2"/>
+      </w:pPr>
+      <w:r>
+        <w:rPr>
+          <w:rFonts w:ascii="Consolas" w:hAnsi="Consolas"/>
+          <w:sz w:val="18"/>
+        </w:rPr>
+        <w:t>Thuật toán 1  RBA-RiskScore(nhật ký đăng nhập L)</w:t>
+        <w:br/>
+      </w:r>
+      <w:r>
+        <w:rPr>
+          <w:rFonts w:ascii="Consolas" w:hAnsi="Consolas"/>
+          <w:sz w:val="18"/>
+        </w:rPr>
+        <w:t>Đầu vào : L = {user_id, timestamp, country, asn, device, os, browser,</w:t>
+        <w:br/>
+      </w:r>
+      <w:r>
+        <w:rPr>
+          <w:rFonts w:ascii="Consolas" w:hAnsi="Consolas"/>
+          <w:sz w:val="18"/>
+        </w:rPr>
+        <w:t xml:space="preserve">          login_successful, round_trip_time, ...}</w:t>
+        <w:br/>
+      </w:r>
+      <w:r>
+        <w:rPr>
+          <w:rFonts w:ascii="Consolas" w:hAnsi="Consolas"/>
+          <w:sz w:val="18"/>
+        </w:rPr>
+        <w:t>Đầu ra  : xác suất tấn công ŷ ∈ [0, 1]</w:t>
+        <w:br/>
+      </w:r>
+      <w:r>
+        <w:rPr>
+          <w:rFonts w:ascii="Consolas" w:hAnsi="Consolas"/>
+          <w:sz w:val="18"/>
+        </w:rPr>
+        <w:t xml:space="preserve"> </w:t>
+        <w:br/>
+      </w:r>
+      <w:r>
+        <w:rPr>
+          <w:rFonts w:ascii="Consolas" w:hAnsi="Consolas"/>
+          <w:sz w:val="18"/>
+        </w:rPr>
+        <w:t>Bước A. TRÍCH XUẤT ĐẶC TRƯNG(L) → F</w:t>
+        <w:br/>
+      </w:r>
+      <w:r>
+        <w:rPr>
+          <w:rFonts w:ascii="Consolas" w:hAnsi="Consolas"/>
+          <w:sz w:val="18"/>
+        </w:rPr>
+        <w:t xml:space="preserve">  F.thời_gian ← hour_of_day, day_of_week, is_odd_hour</w:t>
+        <w:br/>
+      </w:r>
+      <w:r>
+        <w:rPr>
+          <w:rFonts w:ascii="Consolas" w:hAnsi="Consolas"/>
+          <w:sz w:val="18"/>
+        </w:rPr>
+        <w:t xml:space="preserve">  F.độ_hiếm   ← country_rarity, asn_rarity (tần suất toàn cục, fit trên train)</w:t>
+        <w:br/>
+      </w:r>
+      <w:r>
+        <w:rPr>
+          <w:rFonts w:ascii="Consolas" w:hAnsi="Consolas"/>
+          <w:sz w:val="18"/>
+        </w:rPr>
+        <w:t xml:space="preserve">  F.lịch_sử   ← is_new_country/asn/device/os, time_since_last_login_h,</w:t>
+        <w:br/>
+      </w:r>
+      <w:r>
+        <w:rPr>
+          <w:rFonts w:ascii="Consolas" w:hAnsi="Consolas"/>
+          <w:sz w:val="18"/>
+        </w:rPr>
+        <w:t xml:space="preserve">                user_success_rate_so_far, num_changes</w:t>
+        <w:br/>
+      </w:r>
+      <w:r>
+        <w:rPr>
+          <w:rFonts w:ascii="Consolas" w:hAnsi="Consolas"/>
+          <w:sz w:val="18"/>
+        </w:rPr>
+        <w:t xml:space="preserve">                (chỉ dùng sự kiện TRƯỚC thời điểm hiện tại của user)</w:t>
+        <w:br/>
+      </w:r>
+      <w:r>
+        <w:rPr>
+          <w:rFonts w:ascii="Consolas" w:hAnsi="Consolas"/>
+          <w:sz w:val="18"/>
+        </w:rPr>
+        <w:t xml:space="preserve"> </w:t>
+        <w:br/>
+      </w:r>
+      <w:r>
+        <w:rPr>
+          <w:rFonts w:ascii="Consolas" w:hAnsi="Consolas"/>
+          <w:sz w:val="18"/>
+        </w:rPr>
+        <w:t>Bước B. SUY DIỄN MỜ MAMDANI(F) → Z</w:t>
+        <w:br/>
+      </w:r>
+      <w:r>
+        <w:rPr>
+          <w:rFonts w:ascii="Consolas" w:hAnsi="Consolas"/>
+          <w:sz w:val="18"/>
+        </w:rPr>
+        <w:t xml:space="preserve">  với mỗi biến liên tục v ∈ {gap, country_rarity, asn_rarity,</w:t>
+        <w:br/>
+      </w:r>
+      <w:r>
+        <w:rPr>
+          <w:rFonts w:ascii="Consolas" w:hAnsi="Consolas"/>
+          <w:sz w:val="18"/>
+        </w:rPr>
+        <w:t xml:space="preserve">                              success_rate, num_changes}:</w:t>
+        <w:br/>
+      </w:r>
+      <w:r>
+        <w:rPr>
+          <w:rFonts w:ascii="Consolas" w:hAnsi="Consolas"/>
+          <w:sz w:val="18"/>
+        </w:rPr>
+        <w:t xml:space="preserve">        (low, med, high) ← MỜ_HÓA(v, ngưỡng percentile p20/p50/p80 trên train)</w:t>
+        <w:br/>
+      </w:r>
+      <w:r>
+        <w:rPr>
+          <w:rFonts w:ascii="Consolas" w:hAnsi="Consolas"/>
+          <w:sz w:val="18"/>
+        </w:rPr>
+        <w:t xml:space="preserve">  với mỗi luật Ri trong 8 luật IF-THEN (AND = min, OR = max):</w:t>
+        <w:br/>
+      </w:r>
+      <w:r>
+        <w:rPr>
+          <w:rFonts w:ascii="Consolas" w:hAnsi="Consolas"/>
+          <w:sz w:val="18"/>
+        </w:rPr>
+        <w:t xml:space="preserve">        firing_i ← ĐÁNH_GIÁ(Ri, low, med, high)</w:t>
+        <w:br/>
+      </w:r>
+      <w:r>
+        <w:rPr>
+          <w:rFonts w:ascii="Consolas" w:hAnsi="Consolas"/>
+          <w:sz w:val="18"/>
+        </w:rPr>
+        <w:t xml:space="preserve">  agg ← GỘP(firing_1..8, tập mờ ra Low/Medium/High)      { toán tử max }</w:t>
+        <w:br/>
+      </w:r>
+      <w:r>
+        <w:rPr>
+          <w:rFonts w:ascii="Consolas" w:hAnsi="Consolas"/>
+          <w:sz w:val="18"/>
+        </w:rPr>
+        <w:t xml:space="preserve">  Z.mamdani_risk_score ← GIẢI_MỜ(agg)                     { phương pháp centroid }</w:t>
+        <w:br/>
+      </w:r>
+      <w:r>
+        <w:rPr>
+          <w:rFonts w:ascii="Consolas" w:hAnsi="Consolas"/>
+          <w:sz w:val="18"/>
+        </w:rPr>
+        <w:t xml:space="preserve">  Z.fz_* ← toàn bộ 15 giá trị độ thuộc</w:t>
+        <w:br/>
+      </w:r>
+      <w:r>
+        <w:rPr>
+          <w:rFonts w:ascii="Consolas" w:hAnsi="Consolas"/>
+          <w:sz w:val="18"/>
+        </w:rPr>
+        <w:t xml:space="preserve"> </w:t>
+        <w:br/>
+      </w:r>
+      <w:r>
+        <w:rPr>
+          <w:rFonts w:ascii="Consolas" w:hAnsi="Consolas"/>
+          <w:sz w:val="18"/>
+        </w:rPr>
+        <w:t>Bước C. TIỀN XỬ LÝ(F, Z) → X</w:t>
+        <w:br/>
+      </w:r>
+      <w:r>
+        <w:rPr>
+          <w:rFonts w:ascii="Consolas" w:hAnsi="Consolas"/>
+          <w:sz w:val="18"/>
+        </w:rPr>
+        <w:t xml:space="preserve">  chia(L) → train / val / test (70/15/15, phân tầng theo nhãn)</w:t>
+        <w:br/>
+      </w:r>
+      <w:r>
+        <w:rPr>
+          <w:rFonts w:ascii="Consolas" w:hAnsi="Consolas"/>
+          <w:sz w:val="18"/>
+        </w:rPr>
+        <w:t xml:space="preserve">  scaler ← fit StandardScaler(F.số | train)</w:t>
+        <w:br/>
+      </w:r>
+      <w:r>
+        <w:rPr>
+          <w:rFonts w:ascii="Consolas" w:hAnsi="Consolas"/>
+          <w:sz w:val="18"/>
+        </w:rPr>
+        <w:t xml:space="preserve">  ohe    ← fit OneHotEncoder(F.loại_thiết_bị | train)</w:t>
+        <w:br/>
+      </w:r>
+      <w:r>
+        <w:rPr>
+          <w:rFonts w:ascii="Consolas" w:hAnsi="Consolas"/>
+          <w:sz w:val="18"/>
+        </w:rPr>
+        <w:t xml:space="preserve">  fis    ← fit MamdaniFuzzyRiskSystem(F | train)</w:t>
+        <w:br/>
+      </w:r>
+      <w:r>
+        <w:rPr>
+          <w:rFonts w:ascii="Consolas" w:hAnsi="Consolas"/>
+          <w:sz w:val="18"/>
+        </w:rPr>
+        <w:t xml:space="preserve">  X ← ghép(scaler.transform(F.số), ohe.transform(F.loại_thiết_bị), fis.transform(F))</w:t>
+        <w:br/>
+      </w:r>
+      <w:r>
+        <w:rPr>
+          <w:rFonts w:ascii="Consolas" w:hAnsi="Consolas"/>
+          <w:sz w:val="18"/>
+        </w:rPr>
+        <w:t xml:space="preserve"> </w:t>
+        <w:br/>
+      </w:r>
+      <w:r>
+        <w:rPr>
+          <w:rFonts w:ascii="Consolas" w:hAnsi="Consolas"/>
+          <w:sz w:val="18"/>
+        </w:rPr>
+        <w:t>Bước D. LAN TRUYỀN XUÔI MLP(X) → ŷ</w:t>
+        <w:br/>
+      </w:r>
+      <w:r>
+        <w:rPr>
+          <w:rFonts w:ascii="Consolas" w:hAnsi="Consolas"/>
+          <w:sz w:val="18"/>
+        </w:rPr>
+        <w:t xml:space="preserve">  h ← X</w:t>
+        <w:br/>
+      </w:r>
+      <w:r>
+        <w:rPr>
+          <w:rFonts w:ascii="Consolas" w:hAnsi="Consolas"/>
+          <w:sz w:val="18"/>
+        </w:rPr>
+        <w:t xml:space="preserve">  với mỗi chiều_ẩn ∈ (128, 64, 32):</w:t>
+        <w:br/>
+      </w:r>
+      <w:r>
+        <w:rPr>
+          <w:rFonts w:ascii="Consolas" w:hAnsi="Consolas"/>
+          <w:sz w:val="18"/>
+        </w:rPr>
+        <w:t xml:space="preserve">        h ← Dropout(BatchNorm(ReLU(Linear(h, chiều_ẩn))))</w:t>
+        <w:br/>
+      </w:r>
+      <w:r>
+        <w:rPr>
+          <w:rFonts w:ascii="Consolas" w:hAnsi="Consolas"/>
+          <w:sz w:val="18"/>
+        </w:rPr>
+        <w:t xml:space="preserve">  logit ← Linear(h, 1)</w:t>
+        <w:br/>
+      </w:r>
+      <w:r>
+        <w:rPr>
+          <w:rFonts w:ascii="Consolas" w:hAnsi="Consolas"/>
+          <w:sz w:val="18"/>
+        </w:rPr>
+        <w:t xml:space="preserve">  ŷ ← sigmoid(logit)                                       { xác suất tấn công }</w:t>
+        <w:br/>
+      </w:r>
+      <w:r>
+        <w:rPr>
+          <w:rFonts w:ascii="Consolas" w:hAnsi="Consolas"/>
+          <w:sz w:val="18"/>
+        </w:rPr>
+        <w:t xml:space="preserve"> </w:t>
+        <w:br/>
+      </w:r>
+      <w:r>
+        <w:rPr>
+          <w:rFonts w:ascii="Consolas" w:hAnsi="Consolas"/>
+          <w:sz w:val="18"/>
+        </w:rPr>
+        <w:t>Bước E. HUẤN LUYỆN (chỉ ở pha huấn luyện)</w:t>
+        <w:br/>
+      </w:r>
+      <w:r>
+        <w:rPr>
+          <w:rFonts w:ascii="Consolas" w:hAnsi="Consolas"/>
+          <w:sz w:val="18"/>
+        </w:rPr>
+        <w:t xml:space="preserve">  loss ← BCEWithLogits(logit, y_thật; pos_weight = n_âm/n_dương)</w:t>
+        <w:br/>
+      </w:r>
+      <w:r>
+        <w:rPr>
+          <w:rFonts w:ascii="Consolas" w:hAnsi="Consolas"/>
+          <w:sz w:val="18"/>
+        </w:rPr>
+        <w:t xml:space="preserve">  ∇θ ← Lan_truyền_ngược(loss)</w:t>
+        <w:br/>
+      </w:r>
+      <w:r>
+        <w:rPr>
+          <w:rFonts w:ascii="Consolas" w:hAnsi="Consolas"/>
+          <w:sz w:val="18"/>
+        </w:rPr>
+        <w:t xml:space="preserve">  θ ← θ − Adam(∇θ, lr = 1e-3, weight_decay = 1e-5)</w:t>
+        <w:br/>
+      </w:r>
+      <w:r>
+        <w:rPr>
+          <w:rFonts w:ascii="Consolas" w:hAnsi="Consolas"/>
+          <w:sz w:val="18"/>
+        </w:rPr>
+        <w:t xml:space="preserve">  lặp theo mini-batch (4096 mẫu) × tối đa 30 epoch</w:t>
+        <w:br/>
+      </w:r>
+      <w:r>
+        <w:rPr>
+          <w:rFonts w:ascii="Consolas" w:hAnsi="Consolas"/>
+          <w:sz w:val="18"/>
+        </w:rPr>
+        <w:t xml:space="preserve">  dừng sớm nếu val_AUPRC không cải thiện sau 5 epoch</w:t>
+        <w:br/>
+      </w:r>
+      <w:r>
+        <w:rPr>
+          <w:rFonts w:ascii="Consolas" w:hAnsi="Consolas"/>
+          <w:sz w:val="18"/>
+        </w:rPr>
+        <w:t xml:space="preserve"> </w:t>
+        <w:br/>
+      </w:r>
+      <w:r>
+        <w:rPr>
+          <w:rFonts w:ascii="Consolas" w:hAnsi="Consolas"/>
+          <w:sz w:val="18"/>
+        </w:rPr>
+        <w:t>Trả về ŷ = xác suất tấn công</w:t>
+      </w:r>
+    </w:p>
+    <w:p>
+      <w:pPr>
         <w:pStyle w:val="Heading1"/>
       </w:pPr>
       <w:r>
@@ -3677,10 +4048,545 @@
         <w:pStyle w:val="Heading2"/>
       </w:pPr>
       <w:r>
+        <w:t>3.3. Ablation study</w:t>
+      </w:r>
+    </w:p>
+    <w:p>
+      <w:pPr/>
+      <w:r>
+        <w:t>Để kiểm chứng đóng góp thực sự của nhánh Mamdani FIS, nhóm huấn luyện lại cùng kiến trúc MLP, cùng cách chia tập train/val/test và cùng seed, nhưng loại bỏ toàn bộ 16 đặc trưng mờ (15 mức độ thuộc và mamdani_risk_score) khỏi đầu vào. Nếu biến thể có đặc trưng mờ vượt trội, đó là bằng chứng cho thấy nhánh Mamdani mang lại tín hiệu mà MLP không tự trích xuất được tốt bằng chỉ từ đặc trưng số thô.</w:t>
+      </w:r>
+    </w:p>
+    <w:p>
+      <w:pPr>
+        <w:pStyle w:val="JTECaption"/>
+        <w:jc w:val="right"/>
+      </w:pPr>
+      <w:r>
+        <w:rPr>
+          <w:b/>
+        </w:rPr>
+        <w:t xml:space="preserve">Bảng 3. </w:t>
+      </w:r>
+      <w:r>
+        <w:rPr>
+          <w:i/>
+        </w:rPr>
+        <w:t>So sánh MLP không có đặc trưng mờ và MLP có đặc trưng mờ (Mamdani FIS)</w:t>
+      </w:r>
+    </w:p>
+    <w:tbl>
+      <w:tblPr>
+        <w:tblW w:type="dxa" w:w="9071"/>
+        <w:tblLook w:firstColumn="1" w:firstRow="1" w:lastColumn="0" w:lastRow="0" w:noHBand="0" w:noVBand="1" w:val="04A0"/>
+        <w:tblLayout w:type="fixed"/>
+        <w:tblBorders>
+          <w:top w:val="single" w:sz="4" w:space="0" w:color="000000"/>
+          <w:bottom w:val="single" w:sz="4" w:space="0" w:color="000000"/>
+          <w:insideH w:val="single" w:sz="4" w:space="0" w:color="000000"/>
+          <w:left w:val="nil"/>
+          <w:right w:val="nil"/>
+          <w:insideV w:val="nil"/>
+        </w:tblBorders>
+      </w:tblPr>
+      <w:tblGrid>
+        <w:gridCol w:w="2268"/>
+        <w:gridCol w:w="2268"/>
+        <w:gridCol w:w="2268"/>
+        <w:gridCol w:w="2268"/>
+      </w:tblGrid>
+      <w:tr>
+        <w:tc>
+          <w:tcPr>
+            <w:tcW w:type="dxa" w:w="2268"/>
+          </w:tcPr>
+          <w:p>
+            <w:pPr>
+              <w:jc w:val="center"/>
+            </w:pPr>
+            <w:r>
+              <w:rPr>
+                <w:b/>
+                <w:sz w:val="20"/>
+              </w:rPr>
+              <w:t>Chỉ số</w:t>
+            </w:r>
+          </w:p>
+        </w:tc>
+        <w:tc>
+          <w:tcPr>
+            <w:tcW w:type="dxa" w:w="2268"/>
+          </w:tcPr>
+          <w:p>
+            <w:pPr>
+              <w:jc w:val="center"/>
+            </w:pPr>
+            <w:r>
+              <w:rPr>
+                <w:b/>
+                <w:sz w:val="20"/>
+              </w:rPr>
+              <w:t>MLP không Fuzzy</w:t>
+            </w:r>
+          </w:p>
+        </w:tc>
+        <w:tc>
+          <w:tcPr>
+            <w:tcW w:type="dxa" w:w="2268"/>
+          </w:tcPr>
+          <w:p>
+            <w:pPr>
+              <w:jc w:val="center"/>
+            </w:pPr>
+            <w:r>
+              <w:rPr>
+                <w:b/>
+                <w:sz w:val="20"/>
+              </w:rPr>
+              <w:t>MLP + Mamdani FIS</w:t>
+            </w:r>
+          </w:p>
+        </w:tc>
+        <w:tc>
+          <w:tcPr>
+            <w:tcW w:type="dxa" w:w="2268"/>
+          </w:tcPr>
+          <w:p>
+            <w:pPr>
+              <w:jc w:val="center"/>
+            </w:pPr>
+            <w:r>
+              <w:rPr>
+                <w:b/>
+                <w:sz w:val="20"/>
+              </w:rPr>
+              <w:t>Chênh lệch</w:t>
+            </w:r>
+          </w:p>
+        </w:tc>
+      </w:tr>
+      <w:tr>
+        <w:tc>
+          <w:tcPr>
+            <w:tcW w:type="dxa" w:w="2268"/>
+          </w:tcPr>
+          <w:p>
+            <w:pPr>
+              <w:jc w:val="left"/>
+            </w:pPr>
+            <w:r>
+              <w:rPr>
+                <w:sz w:val="20"/>
+              </w:rPr>
+              <w:t>AUROC</w:t>
+            </w:r>
+          </w:p>
+        </w:tc>
+        <w:tc>
+          <w:tcPr>
+            <w:tcW w:type="dxa" w:w="2268"/>
+          </w:tcPr>
+          <w:p>
+            <w:pPr>
+              <w:jc w:val="center"/>
+            </w:pPr>
+            <w:r>
+              <w:rPr>
+                <w:sz w:val="20"/>
+              </w:rPr>
+              <w:t>0,8673</w:t>
+            </w:r>
+          </w:p>
+        </w:tc>
+        <w:tc>
+          <w:tcPr>
+            <w:tcW w:type="dxa" w:w="2268"/>
+          </w:tcPr>
+          <w:p>
+            <w:pPr>
+              <w:jc w:val="center"/>
+            </w:pPr>
+            <w:r>
+              <w:rPr>
+                <w:sz w:val="20"/>
+              </w:rPr>
+              <w:t>0,8766</w:t>
+            </w:r>
+          </w:p>
+        </w:tc>
+        <w:tc>
+          <w:tcPr>
+            <w:tcW w:type="dxa" w:w="2268"/>
+          </w:tcPr>
+          <w:p>
+            <w:pPr>
+              <w:jc w:val="center"/>
+            </w:pPr>
+            <w:r>
+              <w:rPr>
+                <w:sz w:val="20"/>
+              </w:rPr>
+              <w:t>+0,0093</w:t>
+            </w:r>
+          </w:p>
+        </w:tc>
+      </w:tr>
+      <w:tr>
+        <w:tc>
+          <w:tcPr>
+            <w:tcW w:type="dxa" w:w="2268"/>
+          </w:tcPr>
+          <w:p>
+            <w:pPr>
+              <w:jc w:val="left"/>
+            </w:pPr>
+            <w:r>
+              <w:rPr>
+                <w:sz w:val="20"/>
+              </w:rPr>
+              <w:t>AUPRC</w:t>
+            </w:r>
+          </w:p>
+        </w:tc>
+        <w:tc>
+          <w:tcPr>
+            <w:tcW w:type="dxa" w:w="2268"/>
+          </w:tcPr>
+          <w:p>
+            <w:pPr>
+              <w:jc w:val="center"/>
+            </w:pPr>
+            <w:r>
+              <w:rPr>
+                <w:sz w:val="20"/>
+              </w:rPr>
+              <w:t>0,2080</w:t>
+            </w:r>
+          </w:p>
+        </w:tc>
+        <w:tc>
+          <w:tcPr>
+            <w:tcW w:type="dxa" w:w="2268"/>
+          </w:tcPr>
+          <w:p>
+            <w:pPr>
+              <w:jc w:val="center"/>
+            </w:pPr>
+            <w:r>
+              <w:rPr>
+                <w:sz w:val="20"/>
+              </w:rPr>
+              <w:t>0,2147</w:t>
+            </w:r>
+          </w:p>
+        </w:tc>
+        <w:tc>
+          <w:tcPr>
+            <w:tcW w:type="dxa" w:w="2268"/>
+          </w:tcPr>
+          <w:p>
+            <w:pPr>
+              <w:jc w:val="center"/>
+            </w:pPr>
+            <w:r>
+              <w:rPr>
+                <w:sz w:val="20"/>
+              </w:rPr>
+              <w:t>+0,0067</w:t>
+            </w:r>
+          </w:p>
+        </w:tc>
+      </w:tr>
+      <w:tr>
+        <w:tc>
+          <w:tcPr>
+            <w:tcW w:type="dxa" w:w="2268"/>
+          </w:tcPr>
+          <w:p>
+            <w:pPr>
+              <w:jc w:val="left"/>
+            </w:pPr>
+            <w:r>
+              <w:rPr>
+                <w:sz w:val="20"/>
+              </w:rPr>
+              <w:t>Accuracy</w:t>
+            </w:r>
+          </w:p>
+        </w:tc>
+        <w:tc>
+          <w:tcPr>
+            <w:tcW w:type="dxa" w:w="2268"/>
+          </w:tcPr>
+          <w:p>
+            <w:pPr>
+              <w:jc w:val="center"/>
+            </w:pPr>
+            <w:r>
+              <w:rPr>
+                <w:sz w:val="20"/>
+              </w:rPr>
+              <w:t>0,7936</w:t>
+            </w:r>
+          </w:p>
+        </w:tc>
+        <w:tc>
+          <w:tcPr>
+            <w:tcW w:type="dxa" w:w="2268"/>
+          </w:tcPr>
+          <w:p>
+            <w:pPr>
+              <w:jc w:val="center"/>
+            </w:pPr>
+            <w:r>
+              <w:rPr>
+                <w:sz w:val="20"/>
+              </w:rPr>
+              <w:t>0,7919</w:t>
+            </w:r>
+          </w:p>
+        </w:tc>
+        <w:tc>
+          <w:tcPr>
+            <w:tcW w:type="dxa" w:w="2268"/>
+          </w:tcPr>
+          <w:p>
+            <w:pPr>
+              <w:jc w:val="center"/>
+            </w:pPr>
+            <w:r>
+              <w:rPr>
+                <w:sz w:val="20"/>
+              </w:rPr>
+              <w:t>−0,0017</w:t>
+            </w:r>
+          </w:p>
+        </w:tc>
+      </w:tr>
+      <w:tr>
+        <w:tc>
+          <w:tcPr>
+            <w:tcW w:type="dxa" w:w="2268"/>
+          </w:tcPr>
+          <w:p>
+            <w:pPr>
+              <w:jc w:val="left"/>
+            </w:pPr>
+            <w:r>
+              <w:rPr>
+                <w:sz w:val="20"/>
+              </w:rPr>
+              <w:t>Precision</w:t>
+            </w:r>
+          </w:p>
+        </w:tc>
+        <w:tc>
+          <w:tcPr>
+            <w:tcW w:type="dxa" w:w="2268"/>
+          </w:tcPr>
+          <w:p>
+            <w:pPr>
+              <w:jc w:val="center"/>
+            </w:pPr>
+            <w:r>
+              <w:rPr>
+                <w:sz w:val="20"/>
+              </w:rPr>
+              <w:t>0,1119</w:t>
+            </w:r>
+          </w:p>
+        </w:tc>
+        <w:tc>
+          <w:tcPr>
+            <w:tcW w:type="dxa" w:w="2268"/>
+          </w:tcPr>
+          <w:p>
+            <w:pPr>
+              <w:jc w:val="center"/>
+            </w:pPr>
+            <w:r>
+              <w:rPr>
+                <w:sz w:val="20"/>
+              </w:rPr>
+              <w:t>0,1128</w:t>
+            </w:r>
+          </w:p>
+        </w:tc>
+        <w:tc>
+          <w:tcPr>
+            <w:tcW w:type="dxa" w:w="2268"/>
+          </w:tcPr>
+          <w:p>
+            <w:pPr>
+              <w:jc w:val="center"/>
+            </w:pPr>
+            <w:r>
+              <w:rPr>
+                <w:sz w:val="20"/>
+              </w:rPr>
+              <w:t>+0,0009</w:t>
+            </w:r>
+          </w:p>
+        </w:tc>
+      </w:tr>
+      <w:tr>
+        <w:tc>
+          <w:tcPr>
+            <w:tcW w:type="dxa" w:w="2268"/>
+          </w:tcPr>
+          <w:p>
+            <w:pPr>
+              <w:jc w:val="left"/>
+            </w:pPr>
+            <w:r>
+              <w:rPr>
+                <w:sz w:val="20"/>
+              </w:rPr>
+              <w:t>Recall</w:t>
+            </w:r>
+          </w:p>
+        </w:tc>
+        <w:tc>
+          <w:tcPr>
+            <w:tcW w:type="dxa" w:w="2268"/>
+          </w:tcPr>
+          <w:p>
+            <w:pPr>
+              <w:jc w:val="center"/>
+            </w:pPr>
+            <w:r>
+              <w:rPr>
+                <w:sz w:val="20"/>
+              </w:rPr>
+              <w:t>0,8275</w:t>
+            </w:r>
+          </w:p>
+        </w:tc>
+        <w:tc>
+          <w:tcPr>
+            <w:tcW w:type="dxa" w:w="2268"/>
+          </w:tcPr>
+          <w:p>
+            <w:pPr>
+              <w:jc w:val="center"/>
+            </w:pPr>
+            <w:r>
+              <w:rPr>
+                <w:sz w:val="20"/>
+              </w:rPr>
+              <w:t>0,8441</w:t>
+            </w:r>
+          </w:p>
+        </w:tc>
+        <w:tc>
+          <w:tcPr>
+            <w:tcW w:type="dxa" w:w="2268"/>
+          </w:tcPr>
+          <w:p>
+            <w:pPr>
+              <w:jc w:val="center"/>
+            </w:pPr>
+            <w:r>
+              <w:rPr>
+                <w:sz w:val="20"/>
+              </w:rPr>
+              <w:t>+0,0166</w:t>
+            </w:r>
+          </w:p>
+        </w:tc>
+      </w:tr>
+      <w:tr>
+        <w:tc>
+          <w:tcPr>
+            <w:tcW w:type="dxa" w:w="2268"/>
+          </w:tcPr>
+          <w:p>
+            <w:pPr>
+              <w:jc w:val="left"/>
+            </w:pPr>
+            <w:r>
+              <w:rPr>
+                <w:sz w:val="20"/>
+              </w:rPr>
+              <w:t>F1</w:t>
+            </w:r>
+          </w:p>
+        </w:tc>
+        <w:tc>
+          <w:tcPr>
+            <w:tcW w:type="dxa" w:w="2268"/>
+          </w:tcPr>
+          <w:p>
+            <w:pPr>
+              <w:jc w:val="center"/>
+            </w:pPr>
+            <w:r>
+              <w:rPr>
+                <w:sz w:val="20"/>
+              </w:rPr>
+              <w:t>0,1971</w:t>
+            </w:r>
+          </w:p>
+        </w:tc>
+        <w:tc>
+          <w:tcPr>
+            <w:tcW w:type="dxa" w:w="2268"/>
+          </w:tcPr>
+          <w:p>
+            <w:pPr>
+              <w:jc w:val="center"/>
+            </w:pPr>
+            <w:r>
+              <w:rPr>
+                <w:sz w:val="20"/>
+              </w:rPr>
+              <w:t>0,1990</w:t>
+            </w:r>
+          </w:p>
+        </w:tc>
+        <w:tc>
+          <w:tcPr>
+            <w:tcW w:type="dxa" w:w="2268"/>
+          </w:tcPr>
+          <w:p>
+            <w:pPr>
+              <w:jc w:val="center"/>
+            </w:pPr>
+            <w:r>
+              <w:rPr>
+                <w:sz w:val="20"/>
+              </w:rPr>
+              <w:t>+0,0019</w:t>
+            </w:r>
+          </w:p>
+        </w:tc>
+      </w:tr>
+    </w:tbl>
+    <w:p>
+      <w:pPr/>
+      <w:r>
+        <w:t>Kết quả cho thấy nhánh Mamdani FIS mang lại cải thiện nhất quán nhưng khiêm tốn trên hầu hết chỉ số quan trọng, rõ nhất ở Recall (+0,0166) và AUPRC (+0,0067). Điều này hợp lý vì các đặc trưng mờ về bản chất là hàm phi tuyến tường minh của cùng những biến thô mà MLP đã có sẵn trong đầu vào; MLP có thể tự học một phần các quan hệ phi tuyến này, nhưng việc mã hoá sẵn tri thức chuyên gia qua 8 luật IF-THEN giúp mô hình hội tụ tới tín hiệu rủi ro rõ ràng hơn, đặc biệt cải thiện khả năng phát hiện tấn công (Recall) — chỉ số quan trọng nhất trong bài toán RBA.</w:t>
+      </w:r>
+    </w:p>
+    <w:p>
+      <w:pPr/>
+      <w:r>
+        <w:rPr>
+          <w:i/>
+          <w:sz w:val="20"/>
+        </w:rPr>
+        <w:t>Lưu ý: thực nghiệm ablation được chạy trên một mẫu con của bộ dữ liệu (khoảng 246.600 dòng) để phù hợp tài nguyên tính toán trên Google Colab, không phải toàn bộ 500.000 dòng dùng cho kết quả chính thức ở Bảng 2; xu hướng cải thiện vẫn nhất quán nhưng số tuyệt đối có thể chênh lệch nhẹ nếu chạy lại trên toàn bộ dữ liệu.</w:t>
+      </w:r>
+    </w:p>
+    <w:p>
+      <w:pPr>
+        <w:pStyle w:val="Heading2"/>
+      </w:pPr>
+      <w:r>
         <w:rPr>
           <w:rFonts w:eastAsia="Times New Roman"/>
         </w:rPr>
-        <w:t>3.3. Khả năng giải thích và hạn chế</w:t>
+        <w:t>3.4. Khả năng giải thích và hạn chế</w:t>
       </w:r>
     </w:p>
     <w:p>

</xml_diff>

<commit_message>
Cập nhật file DOCX
</commit_message>
<xml_diff>
--- a/Nhom_10-Nhan_Kien_Tuan.docx
+++ b/Nhom_10-Nhan_Kien_Tuan.docx
@@ -1,6 +1,6 @@
 
 <file path=word/document.xml><?xml version="1.0" encoding="utf-8"?>
-<w:document xmlns:wpc="http://schemas.microsoft.com/office/word/2010/wordprocessingCanvas" xmlns:cx="http://schemas.microsoft.com/office/drawing/2014/chartex" xmlns:cx1="http://schemas.microsoft.com/office/drawing/2015/9/8/chartex" xmlns:cx2="http://schemas.microsoft.com/office/drawing/2015/10/21/chartex" xmlns:cx3="http://schemas.microsoft.com/office/drawing/2016/5/9/chartex" xmlns:cx4="http://schemas.microsoft.com/office/drawing/2016/5/10/chartex" xmlns:cx5="http://schemas.microsoft.com/office/drawing/2016/5/11/chartex" xmlns:cx6="http://schemas.microsoft.com/office/drawing/2016/5/12/chartex" xmlns:cx7="http://schemas.microsoft.com/office/drawing/2016/5/13/chartex" xmlns:cx8="http://schemas.microsoft.com/office/drawing/2016/5/14/chartex" xmlns:mc="http://schemas.openxmlformats.org/markup-compatibility/2006" xmlns:aink="http://schemas.microsoft.com/office/drawing/2016/ink" xmlns:am3d="http://schemas.microsoft.com/office/drawing/2017/model3d" xmlns:o="urn:schemas-microsoft-com:office:office" xmlns:oel="http://schemas.microsoft.com/office/2019/extlst" xmlns:r="http://schemas.openxmlformats.org/officeDocument/2006/relationships" xmlns:m="http://schemas.openxmlformats.org/officeDocument/2006/math" xmlns:v="urn:schemas-microsoft-com:vml" xmlns:wp14="http://schemas.microsoft.com/office/word/2010/wordprocessingDrawing" xmlns:wp="http://schemas.openxmlformats.org/drawingml/2006/wordprocessingDrawing" xmlns:w10="urn:schemas-microsoft-com:office:word" xmlns:w="http://schemas.openxmlformats.org/wordprocessingml/2006/main" xmlns:w14="http://schemas.microsoft.com/office/word/2010/wordml" xmlns:w15="http://schemas.microsoft.com/office/word/2012/wordml" xmlns:w16cex="http://schemas.microsoft.com/office/word/2018/wordml/cex" xmlns:w16cid="http://schemas.microsoft.com/office/word/2016/wordml/cid" xmlns:w16="http://schemas.microsoft.com/office/word/2018/wordml" xmlns:w16du="http://schemas.microsoft.com/office/word/2023/wordml/word16du" xmlns:w16sdtdh="http://schemas.microsoft.com/office/word/2020/wordml/sdtdatahash" xmlns:w16sdtfl="http://schemas.microsoft.com/office/word/2024/wordml/sdtformatlock" xmlns:w16se="http://schemas.microsoft.com/office/word/2015/wordml/symex" xmlns:wpg="http://schemas.microsoft.com/office/word/2010/wordprocessingGroup" xmlns:wpi="http://schemas.microsoft.com/office/word/2010/wordprocessingInk" xmlns:wne="http://schemas.microsoft.com/office/word/2006/wordml" xmlns:wps="http://schemas.microsoft.com/office/word/2010/wordprocessingShape" mc:Ignorable="w14 w15 w16se w16cid w16 w16cex w16sdtdh w16sdtfl w16du wp14">
+<w:document xmlns:wpc="http://schemas.microsoft.com/office/word/2010/wordprocessingCanvas" xmlns:cx="http://schemas.microsoft.com/office/drawing/2014/chartex" xmlns:cx1="http://schemas.microsoft.com/office/drawing/2015/9/8/chartex" xmlns:cx2="http://schemas.microsoft.com/office/drawing/2015/10/21/chartex" xmlns:cx3="http://schemas.microsoft.com/office/drawing/2016/5/9/chartex" xmlns:cx4="http://schemas.microsoft.com/office/drawing/2016/5/10/chartex" xmlns:cx5="http://schemas.microsoft.com/office/drawing/2016/5/11/chartex" xmlns:cx6="http://schemas.microsoft.com/office/drawing/2016/5/12/chartex" xmlns:cx7="http://schemas.microsoft.com/office/drawing/2016/5/13/chartex" xmlns:cx8="http://schemas.microsoft.com/office/drawing/2016/5/14/chartex" xmlns:mc="http://schemas.openxmlformats.org/markup-compatibility/2006" xmlns:aink="http://schemas.microsoft.com/office/drawing/2016/ink" xmlns:am3d="http://schemas.microsoft.com/office/drawing/2017/model3d" xmlns:o="urn:schemas-microsoft-com:office:office" xmlns:r="http://schemas.openxmlformats.org/officeDocument/2006/relationships" xmlns:m="http://schemas.openxmlformats.org/officeDocument/2006/math" xmlns:v="urn:schemas-microsoft-com:vml" xmlns:wp14="http://schemas.microsoft.com/office/word/2010/wordprocessingDrawing" xmlns:wp="http://schemas.openxmlformats.org/drawingml/2006/wordprocessingDrawing" xmlns:w10="urn:schemas-microsoft-com:office:word" xmlns:w="http://schemas.openxmlformats.org/wordprocessingml/2006/main" xmlns:w14="http://schemas.microsoft.com/office/word/2010/wordml" xmlns:w15="http://schemas.microsoft.com/office/word/2012/wordml" xmlns:w16cex="http://schemas.microsoft.com/office/word/2018/wordml/cex" xmlns:w16cid="http://schemas.microsoft.com/office/word/2016/wordml/cid" xmlns:w16="http://schemas.microsoft.com/office/word/2018/wordml" xmlns:w16sdtdh="http://schemas.microsoft.com/office/word/2020/wordml/sdtdatahash" xmlns:w16se="http://schemas.microsoft.com/office/word/2015/wordml/symex" xmlns:wpg="http://schemas.microsoft.com/office/word/2010/wordprocessingGroup" xmlns:wpi="http://schemas.microsoft.com/office/word/2010/wordprocessingInk" xmlns:wne="http://schemas.microsoft.com/office/word/2006/wordml" xmlns:wps="http://schemas.microsoft.com/office/word/2010/wordprocessingShape" mc:Ignorable="w14 w15 w16se w16cid w16 w16cex w16sdtdh wp14">
   <w:body>
     <w:tbl>
       <w:tblPr>
@@ -977,7 +977,55 @@
               <w:rPr>
                 <w:sz w:val="18"/>
               </w:rPr>
-              <w:t>Xác thực dựa trên rủi ro đánh giá ngữ cảnh của từng lượt đăng nhập và yêu cầu kiểm tra bổ sung khi mức rủi ro được dự đoán cao. Nghiên cứu này xây dựng mô hình lai kết hợp mạng nơ-ron đa tầng với hệ suy diễn mờ Mamdani nhằm phát hiện các lượt đăng nhập rủi ro. Bộ dữ liệu gồm khoảng 500.000 bản ghi đăng nhập, trong đó tỷ lệ tấn công chỉ khoảng 3%, tạo ra bài toán phân loại mất cân bằng nghiêm trọng. Nhóm trích xuất 19 đặc trưng số và hành vi; đồng thời mờ hóa năm biến liên tục thành các mức thấp, trung bình và cao. Tám luật IF–THEN do chuyên gia thiết kế tạo ra các mức độ thuộc và điểm rủi ro Mamdani tổng hợp; các đặc trưng này được ghép với đặc trưng số đã chuẩn hóa và thông tin thiết bị mã hóa one-hot trước khi đưa vào mạng ba tầng ẩn. Rò rỉ dữ liệu được kiểm soát bằng cách chỉ sử dụng sự kiện quá khứ để tạo đặc trưng lịch sử và chỉ ước lượng thống kê toàn cục trên tập huấn luyện. Trên tập kiểm tra 75.000 dòng, mô hình đạt AUROC 0,877, AUPRC 0,216, Recall 0,843 và F1 0,201. Kết quả cho thấy kiến trúc lai phát hiện được phần lớn lượt tấn công, đồng thời duy trì bằng chứng mờ có khả năng giải thích, phù hợp với quy trình bảo mật ưu tiên xác thực bổ sung thay vì bỏ sót đăng nhập độc hại.</w:t>
+              <w:t>Xác thực dựa trên rủi ro là phương pháp đánh giá mức độ nguy hiểm của từng lượt đăng nhập dựa trên các thông tin như thời gian, vị trí, nhà mạng, thiết bị và lịch sử hoạt động của người dùng. Khi phát hiện dấu hiệu bất thường, hệ thống có thể yêu cầu người dùng thực hiện thêm một bước xác thực thay vì cho phép truy cập ngay. Nghiên cứu này xây dựng mô hình kết hợp giữa mạng nơ-ron đa tầng và hệ suy diễn mờ Mamdani để phát hiện các lượt đăng nhập có nguy cơ tấn công. Bộ dữ liệu gồm khoảng 500.000 lượt đăng nhập, trong đó số lượt tấn công chỉ chiếm khoảng 3%. Từ dữ liệu ban đầu, nhóm tạo ra 19 đặc trưng về thời gian, mạng, vị trí, thiết bị và hành vi người dùng. Năm đặc trưng quan trọng được đưa vào hệ mờ</w:t>
+            </w:r>
+            <w:r>
+              <w:rPr>
+                <w:sz w:val="18"/>
+              </w:rPr>
+              <w:t xml:space="preserve"> </w:t>
+            </w:r>
+            <w:r>
+              <w:rPr>
+                <w:sz w:val="18"/>
+              </w:rPr>
+              <w:t>Mamdani</w:t>
+            </w:r>
+            <w:r>
+              <w:rPr>
+                <w:sz w:val="18"/>
+              </w:rPr>
+              <w:t xml:space="preserve"> và đánh giá thông qua tám luật IF–THEN để tạo ra các mức độ rủi ro và một điểm rủi ro tổng hợp</w:t>
+            </w:r>
+            <w:r>
+              <w:rPr>
+                <w:sz w:val="18"/>
+              </w:rPr>
+              <w:t xml:space="preserve"> (</w:t>
+            </w:r>
+            <w:r>
+              <w:rPr>
+                <w:sz w:val="18"/>
+              </w:rPr>
+              <w:t>con số thể hiện mức độ nguy hiểm của lượt đăng nhập</w:t>
+            </w:r>
+            <w:r>
+              <w:rPr>
+                <w:sz w:val="18"/>
+              </w:rPr>
+              <w:t>)</w:t>
+            </w:r>
+            <w:r>
+              <w:rPr>
+                <w:sz w:val="18"/>
+              </w:rPr>
+              <w:t>. Các đặc trưng này sau đó được kết hợp với dữ liệu đã tiền xử lý và đưa vào mạng nơ-ron có ba tầng ẩn để phân loại. Để tránh rò rỉ dữ liệu, các đặc trưng lịch sử chỉ sử dụng thông tin xảy ra trước thời điểm đăng nhập hiện tại, còn các thông số tiền xử lý chỉ được tính trên tập huấn luyện. Trên tập kiểm tra gồm 75.000 lượt đăng nhập, mô hình đạt AUROC 0,877, AUPRC 0,216, Recall 0,843 và F1-score 0,201. Kết quả cho thấy mô hình phát hiện được phần lớn lượt tấn công và vẫn cung cấp các thông tin giúp giải thích nguyên nhân một lượt đăng nhập bị đánh giá là rủi ro</w:t>
+            </w:r>
+            <w:r>
+              <w:rPr>
+                <w:sz w:val="18"/>
+              </w:rPr>
+              <w:t>.</w:t>
             </w:r>
           </w:p>
         </w:tc>
@@ -1337,6 +1385,23 @@
               </w:rPr>
               <w:t>Phát hiện đăng nhập bất thường.</w:t>
             </w:r>
+          </w:p>
+          <w:p>
+            <w:pPr>
+              <w:rPr>
+                <w:sz w:val="18"/>
+                <w:szCs w:val="18"/>
+              </w:rPr>
+            </w:pPr>
+          </w:p>
+          <w:p>
+            <w:pPr>
+              <w:ind w:firstLine="0"/>
+              <w:rPr>
+                <w:sz w:val="18"/>
+                <w:szCs w:val="18"/>
+              </w:rPr>
+            </w:pPr>
           </w:p>
           <w:p>
             <w:pPr>
@@ -1450,6 +1515,7 @@
           <w:rFonts w:eastAsia="Times New Roman"/>
           <w:lang w:val="en-US"/>
         </w:rPr>
+        <w:lastRenderedPageBreak/>
         <w:t>1. Giới thiệu</w:t>
       </w:r>
     </w:p>
@@ -1463,13 +1529,7 @@
         <w:rPr>
           <w:lang w:val="en-US"/>
         </w:rPr>
-        <w:t xml:space="preserve">Xác thực dựa trên rủi ro (Risk-Based Authentication - RBA) mở rộng cơ chế đăng nhập truyền thống bằng cách ước lượng mức nguy hiểm của mỗi yêu cầu dựa trên ngữ cảnh như vị trí, nhà mạng, thiết bị, </w:t>
-      </w:r>
-      <w:r>
-        <w:rPr>
-          <w:lang w:val="en-US"/>
-        </w:rPr>
-        <w:t>thời điểm và lịch sử hành vi. Thay vì áp dụng cùng một mức kiểm tra cho mọi người dùng, hệ thống có thể cho phép lượt đăng nhập rủi ro thấp đi qua và yêu cầu mật khẩu dùng một lần hoặc xác thực hai yếu tố đối với trường hợp rủi ro cao. Cách tiếp cận này tạo sự cân bằng giữa an toàn và trải nghiệm sử dụng, đồng thời đã được khảo sát thực nghiệm trên dữ liệu đăng nhập thực tế [1], [6].</w:t>
+        <w:t>Xác thực dựa trên rủi ro (Risk-Based Authentication – RBA) là phương pháp đánh giá mức độ an toàn của từng lượt đăng nhập. Hệ thống không chỉ kiểm tra tên đăng nhập và mật khẩu mà còn xem xét các thông tin như vị trí, nhà mạng, thiết bị, thời điểm đăng nhập và lịch sử hoạt động của người dùng. Lượt đăng nhập có rủi ro thấp có thể được cho phép truy cập bình thường. Ngược lại, khi phát hiện dấu hiệu bất thường, hệ thống sẽ yêu cầu người dùng thực hiện thêm một bước xác thực, chẳng hạn nhập mã OTP hoặc xác thực hai yếu tố. Nhờ đó, RBA giúp tăng mức độ bảo mật nhưng vẫn hạn chế gây bất tiện cho người dùng [1], [6].</w:t>
       </w:r>
     </w:p>
     <w:p>
@@ -1482,7 +1542,37 @@
         <w:rPr>
           <w:lang w:val="en-US"/>
         </w:rPr>
-        <w:t>Bài toán phát hiện đăng nhập rủi ro thường có tỷ lệ tấn công rất thấp so với số lượt bình thường. Trong bối cảnh đó, Accuracy có thể cao ngay cả khi mô hình bỏ sót phần lớn lớp tấn công. Mô hình cần học quan hệ phi tuyến giữa nhiều tín hiệu ngữ cảnh, nhưng đồng thời phải cung cấp căn cứ đủ rõ để người quản trị hiểu vì sao một lượt đăng nhập bị đánh dấu. Mạng nơ-ron đa tầng (Multi-Layer Perceptron - MLP) có khả năng xấp xỉ các quan hệ phi tuyến phức tạp [3], trong khi hệ suy diễn mờ Mamdani biểu diễn tri thức chuyên gia bằng các luật ngôn ngữ minh bạch [2].</w:t>
+        <w:t xml:space="preserve">Một khó khăn của bài toán này là số lượt đăng nhập tấn công rất ít so với số lượt đăng nhập bình thường. Vì vậy, một mô hình có thể đạt Accuracy cao nhưng vẫn bỏ sót nhiều cuộc tấn công. Ngoài ra, mức độ rủi ro của một lượt đăng nhập thường phụ thuộc vào sự kết hợp của nhiều yếu tố. Ví dụ, một thiết bị mới chưa chắc là nguy hiểm, nhưng thiết bị mới kết hợp với quốc gia </w:t>
+      </w:r>
+      <w:r>
+        <w:rPr>
+          <w:lang w:val="en-US"/>
+        </w:rPr>
+        <w:t>khác</w:t>
+      </w:r>
+      <w:r>
+        <w:rPr>
+          <w:lang w:val="en-US"/>
+        </w:rPr>
+        <w:t xml:space="preserve">, nhà mạng </w:t>
+      </w:r>
+      <w:r>
+        <w:rPr>
+          <w:lang w:val="en-US"/>
+        </w:rPr>
+        <w:t>khác</w:t>
+      </w:r>
+      <w:r>
+        <w:rPr>
+          <w:lang w:val="en-US"/>
+        </w:rPr>
+        <w:t xml:space="preserve"> và thời điểm bất thường có thể cho thấy rủi ro cao. Do đó, mô hình cần có khả năng học được các mối quan hệ phức tạp giữa nhiều đặc trưng. Đồng thời, hệ thống cũng cần giải thích được vì sao một lượt đăng nhập bị đánh dấu là rủi ro. Mạng nơ-ron đa tầng có khả năng học các mối quan hệ phức tạp từ dữ liệu [3], trong khi hệ suy diễn mờ Mamdani có thể thể hiện kiến thức chuyên gia bằng các luật IF–THEN dễ hiểu [2]</w:t>
+      </w:r>
+      <w:r>
+        <w:rPr>
+          <w:lang w:val="en-US"/>
+        </w:rPr>
+        <w:t>.</w:t>
       </w:r>
     </w:p>
     <w:p>
@@ -1495,7 +1585,13 @@
         <w:rPr>
           <w:lang w:val="en-US"/>
         </w:rPr>
-        <w:t>Nghiên cứu đề xuất kết hợp hai thành phần ở mức đặc trưng. Hệ Mamdani chuyển các tín hiệu hành vi thành mức độ thuộc và điểm rủi ro giải thích được; các giá trị này được ghép với đặc trưng số và đặc trưng phân loại để MLP thực hiện phân lớp cuối cùng. Đóng góp chính gồm: (i) xây dựng quy trình trích xuất đặc trưng có kiểm soát rò rỉ dữ liệu; (ii) thiết kế tám luật mờ bất đối xứng theo hướng ưu tiên phát hiện nguy cơ; và (iii) đánh giá mô hình trên tập kiểm tra 75.000 bản ghi bằng các chỉ số phù hợp với dữ liệu mất cân bằng.</w:t>
+        <w:t>Trong nghiên cứu này, hai phương pháp trên được kết hợp ở mức đặc trưng. Hệ suy diễn mờ Mamdani nhận các thông tin về hành vi đăng nhập, sau đó tạo ra các mức độ thuộc và một điểm rủi ro tổng hợp. Những kết quả này được ghép với các đặc trưng số và đặc trưng thiết bị trước khi đưa vào mạng nơ-ron đa tầng để phân loại lượt đăng nhập là bình thường hay có nguy cơ tấn công. Nghiên cứu tập trung vào ba nội dung chính: xây dựng quy trình tạo đặc trưng có kiểm soát rò rỉ dữ liệu; thiết kế tám luật mờ theo hướng ưu tiên phát hiện nguy cơ; và đánh giá mô hình trên 75.000 lượt đăng nhập kiểm tra bằng các chỉ số phù hợp với dữ liệu mất cân bằng</w:t>
+      </w:r>
+      <w:r>
+        <w:rPr>
+          <w:lang w:val="en-US"/>
+        </w:rPr>
+        <w:t>.</w:t>
       </w:r>
     </w:p>
     <w:p>
@@ -1538,7 +1634,7 @@
         <w:rPr>
           <w:lang w:val="en-US"/>
         </w:rPr>
-        <w:t>Bộ dữ liệu sử dụng là Login Data Set for Risk-Based Authentication do Wiefling và cộng sự công bố [1], gồm khoảng 500.000 lượt đăng nhập. Nhãn mục tiêu “Is Attack IP” được quy ước 1 cho lượt đăng nhập đến từ địa chỉ IP tấn công và 0 cho lượt bình thường; tỷ lệ lớp dương xấp xỉ 3%. Dữ liệu được chia theo tỷ lệ 70/15/15 cho tập huấn luyện, xác thực và kiểm tra, đồng thời phân tầng theo nhãn để duy trì tỷ lệ tấn công ở mỗi tập.</w:t>
+        <w:t>Nghiên cứu sử dụng bộ dữ liệu Login Data Set for Risk-Based Authentication do Wiefling và cộng sự công bố [1], gồm khoảng 500.000 lượt đăng nhập. Trong mỗi dòng dữ liệu, nhãn “Is Attack IP” được dùng để xác định lượt đăng nhập có đến từ địa chỉ IP tấn công hay không. Giá trị 1 biểu thị lượt đăng nhập có nguy cơ tấn công, còn giá trị 0 biểu thị lượt đăng nhập bình thường. Số lượt tấn công chỉ chiếm khoảng 3% tổng dữ liệu, vì vậy đây là bài toán có sự chênh lệch lớn giữa hai lớp. Dữ liệu được chia thành ba phần gồm 70% để huấn luyện mô hình, 15% để kiểm tra trong quá trình huấn luyện và 15% để đánh giá kết quả cuối cùng. Việc chia dữ liệu được thực hiện sao cho tỷ lệ lượt tấn công trong ba phần gần giống nhau.</w:t>
       </w:r>
     </w:p>
     <w:p>
@@ -1551,7 +1647,7 @@
         <w:rPr>
           <w:lang w:val="en-US"/>
         </w:rPr>
-        <w:t>Từ dữ liệu thô, nhóm tạo 19 đặc trưng số thuộc bốn nhóm: thời gian đăng nhập; độ trễ mạng; độ hiếm của quốc gia và hệ thống tự trị mạng; và hành vi lịch sử theo từng người dùng. Nhóm hành vi bao gồm thời gian từ lần đăng nhập trước, dấu hiệu thay đổi quốc gia, thành phố, nhà mạng, thiết bị, trình duyệt, hệ điều hành, tỷ lệ đăng nhập thành công tích lũy và tổng số thay đổi. Device Type được mã hóa one-hot. Các đặc trưng số được chuẩn hóa trước khi đưa vào MLP.</w:t>
+        <w:t>Từ các thông tin ban đầu, nhóm tạo ra 19 đặc trưng để mô tả rõ hơn từng lượt đăng nhập. Các đặc trưng này gồm thời điểm đăng nhập, độ trễ mạng, mức độ hiếm của quốc gia và nhà mạng, cùng lịch sử hoạt động của từng người dùng. Nhóm đặc trưng lịch sử cho biết thời gian từ lần đăng nhập trước, quốc gia, thành phố, nhà mạng, thiết bị, trình duyệt hoặc hệ điều hành có thay đổi hay không, tỷ lệ đăng nhập thành công trước đó và tổng số thông tin bị thay đổi. Loại thiết bị được chuyển thành các cột có giá trị 0 hoặc 1 để mô hình có thể xử lý, còn các đặc trưng số được đưa về cùng một thang đo trước khi nhập vào mạng MLP.</w:t>
       </w:r>
     </w:p>
     <w:p>
@@ -1564,7 +1660,13 @@
         <w:rPr>
           <w:lang w:val="en-US"/>
         </w:rPr>
-        <w:t>Để chống rò rỉ dữ liệu, đặc trưng lịch sử tại thời điểm t chỉ sử dụng các sự kiện xảy ra trước t. Median RTT, độ hiếm Country và độ hiếm ASN chỉ được ước lượng trên tập huấn luyện, sau đó áp dụng nguyên trạng cho tập xác thực và kiểm tra. Quy trình tổng thể của hệ lai được trình bày trong Hình 1.</w:t>
+        <w:t>Để kết quả đánh giá không bị cao hơn thực tế, các đặc trưng về lịch sử chỉ sử dụng những lượt đăng nhập xảy ra trước lượt đang được xét. Ngoài ra, các giá trị dùng để điền dữ liệu thiếu và tính mức độ hiếm của quốc gia, nhà mạng chỉ được tính từ tập huấn luyện, sau đó mới áp dụng cho tập xác thực và tập kiểm tra. Quy trình này giúp hạn chế tình trạng mô hình biết trước thông tin từ dữ liệu dùng để đánh giá</w:t>
+      </w:r>
+      <w:r>
+        <w:rPr>
+          <w:lang w:val="en-US"/>
+        </w:rPr>
+        <w:t>. Quy trình tổng thể của hệ lai được trình bày trong Hình 1.</w:t>
       </w:r>
     </w:p>
     <w:p>
@@ -1648,7 +1750,13 @@
     </w:p>
     <w:p>
       <w:r>
-        <w:t>Hệ mờ sử dụng năm biến liên tục: thời gian từ lần đăng nhập trước, độ hiếm quốc gia, độ hiếm ASN, tỷ lệ đăng nhập thành công và số thuộc tính thay đổi. Mỗi biến được mờ hóa thành ba mức Low, Medium và High bằng hàm thuộc tam giác. Các ngưỡng được xác định từ các phân vị 20, 50 và 80 trên tập huấn luyện, nhờ đó hệ mờ thích nghi với phân bố dữ liệu mà không khai thác thông tin từ tập kiểm tra. Hình 2 minh họa hình dạng các hàm thuộc.</w:t>
+        <w:t>Hệ mờ sử dụng năm biến li</w:t>
+      </w:r>
+      <w:r>
+        <w:t xml:space="preserve">ên tục: thời gian từ lần đăng nhập trước, độ hiếm quốc gia, độ hiếm ASN, tỷ lệ đăng nhập thành công và số thuộc tính thay đổi. Mỗi biến được mờ hóa thành ba mức Low, Medium và High bằng hàm thuộc tam giác. Các ngưỡng được xác định từ các phân vị 20, 50 và </w:t>
+      </w:r>
+      <w:r>
+        <w:t>80 trên tập huấn luyện, nhờ đó hệ mờ thích nghi với phân bố dữ liệu mà không khai thác thông tin từ tập kiểm tra. Hình 2 minh họa hình dạng các hàm thuộc.</w:t>
       </w:r>
     </w:p>
     <w:p>
@@ -1734,7 +1842,13 @@
         <w:rPr>
           <w:i/>
         </w:rPr>
-        <w:t>Tám luật mờ IF–THEN dùng để tổng hợp mức rủi ro đăng nhập</w:t>
+        <w:t>Tám luật m</w:t>
+      </w:r>
+      <w:r>
+        <w:rPr>
+          <w:i/>
+        </w:rPr>
+        <w:t>ờ IF–THEN dùng để tổng hợp mức rủi ro đăng nhập</w:t>
       </w:r>
     </w:p>
     <w:tbl>
@@ -2219,7 +2333,14 @@
                 <w:sz w:val="20"/>
                 <w:lang w:val="en-US"/>
               </w:rPr>
-              <w:t>NOT new_country AND NOT new_asn AND changes_low AND success_high</w:t>
+              <w:t xml:space="preserve">NOT new_country AND NOT new_asn AND </w:t>
+            </w:r>
+            <w:r>
+              <w:rPr>
+                <w:sz w:val="20"/>
+                <w:lang w:val="en-US"/>
+              </w:rPr>
+              <w:t>changes_low AND success_high</w:t>
             </w:r>
           </w:p>
         </w:tc>
@@ -2504,12 +2625,21 @@
     </w:tbl>
     <w:p>
       <w:r>
-        <w:t>Toán tử AND được cài đặt bằng min, OR bằng max và NOT bằng 1 - μ. Bốn luật R1-R4 đẩy kết luận về High, hai luật R5-R6 kéo về Low và hai luật R7-R8 giữ mức Medium. Thiết kế bất đối xứng phản ánh ưu tiên bảo mật: tín hiệu nguy cơ mạnh cần làm tăng cảnh báo, còn kết luận an toàn chỉ xuất hiện khi đồng thời thỏa nhiều điều kiện ổn định.</w:t>
+        <w:t xml:space="preserve">Toán tử AND được cài đặt bằng min, OR bằng max và NOT bằng 1 - μ. Bốn luật R1-R4 đẩy </w:t>
+      </w:r>
+      <w:r>
+        <w:t>kết luận về High, hai luật R5-R6 kéo về Low và hai luật R7-R8 giữ mức Medium. Thiết kế bất đối xứng phản ánh ưu tiên bảo mật: tín hiệu nguy cơ mạnh cần làm tăng cảnh báo, còn kết luận an toàn chỉ xuất hiện khi đồng thời thỏa nhiều điều kiện ổn định.</w:t>
       </w:r>
     </w:p>
     <w:p>
       <w:r>
-        <w:t>Quá trình suy diễn gồm bốn bước. Trước hết, các đầu vào được mờ hóa. Tiếp theo, độ kích hoạt của từng luật được tính bằng toán tử min hoặc max. Các tập mờ hệ quả được cắt theo mức kích hoạt và gộp bằng phép max. Cuối cùng, điểm rủi ro được giải mờ bằng phương pháp trọng tâm:</w:t>
+        <w:t>Quá tr</w:t>
+      </w:r>
+      <w:r>
+        <w:t>ình suy diễn gồm bốn bước. Trước hết, các đầu vào được mờ hóa. Tiếp theo, độ kích hoạt của từng luật được tính bằng toán tử min hoặc max. Các tập mờ hệ quả được cắt theo mức kích hoạt và gộp bằng phép max. Cuối cùng, điểm rủi ro được giải mờ bằng phương ph</w:t>
+      </w:r>
+      <w:r>
+        <w:t>áp trọng tâm:</w:t>
       </w:r>
     </w:p>
     <w:tbl>
@@ -2547,51 +2677,147 @@
                 <w:lang w:val="en-US"/>
               </w:rPr>
             </w:pPr>
-            <m:oMath>
-              <m:r>
-                <m:t>risk = </m:t>
-              </m:r>
-              <m:f>
-                <m:num>
-                  <m:nary>
-                    <m:naryPr>
-                      <m:chr m:val="∑"/>
-                      <m:limLoc m:val="undOvr"/>
-                      <m:supHide m:val="1"/>
-                    </m:naryPr>
-                    <m:sub>
-                      <m:r>
-                        <m:t>y</m:t>
-                      </m:r>
-                    </m:sub>
-                    <m:e>
-                      <m:r>
-                        <m:t>[μ(y)·y]</m:t>
-                      </m:r>
-                    </m:e>
-                  </m:nary>
-                </m:num>
-                <m:den>
-                  <m:nary>
-                    <m:naryPr>
-                      <m:chr m:val="∑"/>
-                      <m:limLoc m:val="undOvr"/>
-                      <m:supHide m:val="1"/>
-                    </m:naryPr>
-                    <m:sub>
-                      <m:r>
-                        <m:t>y</m:t>
-                      </m:r>
-                    </m:sub>
-                    <m:e>
-                      <m:r>
-                        <m:t>μ(y)</m:t>
-                      </m:r>
-                    </m:e>
-                  </m:nary>
-                </m:den>
-              </m:f>
-            </m:oMath>
+            <m:oMathPara>
+              <m:oMath>
+                <m:r>
+                  <w:rPr>
+                    <w:rFonts w:ascii="Cambria Math" w:hAnsi="Cambria Math"/>
+                  </w:rPr>
+                  <m:t>risk</m:t>
+                </m:r>
+                <m:r>
+                  <w:rPr>
+                    <w:rFonts w:ascii="Cambria Math" w:hAnsi="Cambria Math"/>
+                  </w:rPr>
+                  <m:t xml:space="preserve"> = </m:t>
+                </m:r>
+                <m:f>
+                  <m:fPr>
+                    <m:ctrlPr>
+                      <w:rPr>
+                        <w:rFonts w:ascii="Cambria Math" w:hAnsi="Cambria Math"/>
+                      </w:rPr>
+                    </m:ctrlPr>
+                  </m:fPr>
+                  <m:num>
+                    <m:nary>
+                      <m:naryPr>
+                        <m:chr m:val="∑"/>
+                        <m:limLoc m:val="undOvr"/>
+                        <m:supHide m:val="1"/>
+                        <m:ctrlPr>
+                          <w:rPr>
+                            <w:rFonts w:ascii="Cambria Math" w:hAnsi="Cambria Math"/>
+                          </w:rPr>
+                        </m:ctrlPr>
+                      </m:naryPr>
+                      <m:sub>
+                        <m:r>
+                          <w:rPr>
+                            <w:rFonts w:ascii="Cambria Math" w:hAnsi="Cambria Math"/>
+                          </w:rPr>
+                          <m:t>y</m:t>
+                        </m:r>
+                      </m:sub>
+                      <m:sup/>
+                      <m:e>
+                        <m:r>
+                          <w:rPr>
+                            <w:rFonts w:ascii="Cambria Math" w:hAnsi="Cambria Math"/>
+                          </w:rPr>
+                          <m:t>[</m:t>
+                        </m:r>
+                        <m:r>
+                          <w:rPr>
+                            <w:rFonts w:ascii="Cambria Math" w:hAnsi="Cambria Math"/>
+                          </w:rPr>
+                          <m:t>μ</m:t>
+                        </m:r>
+                        <m:r>
+                          <w:rPr>
+                            <w:rFonts w:ascii="Cambria Math" w:hAnsi="Cambria Math"/>
+                          </w:rPr>
+                          <m:t>(</m:t>
+                        </m:r>
+                        <m:r>
+                          <w:rPr>
+                            <w:rFonts w:ascii="Cambria Math" w:hAnsi="Cambria Math"/>
+                          </w:rPr>
+                          <m:t>y</m:t>
+                        </m:r>
+                        <m:r>
+                          <w:rPr>
+                            <w:rFonts w:ascii="Cambria Math" w:hAnsi="Cambria Math"/>
+                          </w:rPr>
+                          <m:t>)·</m:t>
+                        </m:r>
+                        <m:r>
+                          <w:rPr>
+                            <w:rFonts w:ascii="Cambria Math" w:hAnsi="Cambria Math"/>
+                          </w:rPr>
+                          <m:t>y</m:t>
+                        </m:r>
+                        <m:r>
+                          <w:rPr>
+                            <w:rFonts w:ascii="Cambria Math" w:hAnsi="Cambria Math"/>
+                          </w:rPr>
+                          <m:t>]</m:t>
+                        </m:r>
+                      </m:e>
+                    </m:nary>
+                  </m:num>
+                  <m:den>
+                    <m:nary>
+                      <m:naryPr>
+                        <m:chr m:val="∑"/>
+                        <m:limLoc m:val="undOvr"/>
+                        <m:supHide m:val="1"/>
+                        <m:ctrlPr>
+                          <w:rPr>
+                            <w:rFonts w:ascii="Cambria Math" w:hAnsi="Cambria Math"/>
+                          </w:rPr>
+                        </m:ctrlPr>
+                      </m:naryPr>
+                      <m:sub>
+                        <m:r>
+                          <w:rPr>
+                            <w:rFonts w:ascii="Cambria Math" w:hAnsi="Cambria Math"/>
+                          </w:rPr>
+                          <m:t>y</m:t>
+                        </m:r>
+                      </m:sub>
+                      <m:sup/>
+                      <m:e>
+                        <m:r>
+                          <w:rPr>
+                            <w:rFonts w:ascii="Cambria Math" w:hAnsi="Cambria Math"/>
+                          </w:rPr>
+                          <m:t>μ</m:t>
+                        </m:r>
+                        <m:r>
+                          <w:rPr>
+                            <w:rFonts w:ascii="Cambria Math" w:hAnsi="Cambria Math"/>
+                          </w:rPr>
+                          <m:t>(</m:t>
+                        </m:r>
+                        <m:r>
+                          <w:rPr>
+                            <w:rFonts w:ascii="Cambria Math" w:hAnsi="Cambria Math"/>
+                          </w:rPr>
+                          <m:t>y</m:t>
+                        </m:r>
+                        <m:r>
+                          <w:rPr>
+                            <w:rFonts w:ascii="Cambria Math" w:hAnsi="Cambria Math"/>
+                          </w:rPr>
+                          <m:t>)</m:t>
+                        </m:r>
+                      </m:e>
+                    </m:nary>
+                  </m:den>
+                </m:f>
+              </m:oMath>
+            </m:oMathPara>
           </w:p>
         </w:tc>
         <w:tc>
@@ -2696,7 +2922,13 @@
     </w:p>
     <w:p>
       <w:r>
-        <w:t>Đầu vào MLP là phép ghép 19 đặc trưng số đã chuẩn hóa, biến Device Type mã hóa one-hot và 16 đặc trưng mờ, tạo vector khoảng 39 chiều. Mạng gồm ba tầng ẩn lần lượt 128, 64 và 32 nơ-ron. Mỗi tầng thực hiện Linear, ReLU, Batch Normalization và Dropout 0,3; tầng cuối có một nơ-ron sinh logit, sau đó hàm sigmoid chuyển logit thành xác suất tấn công. Kiến trúc được cài đặt bằng PyTorch [5] và được trình bày trong Hình 4.</w:t>
+        <w:t>Đầu vào MLP là phép ghép 19 đặc trưng số đã chuẩn hóa, biến Device Type mã hóa one-hot và 16 đặc trưng mờ, tạo vecto</w:t>
+      </w:r>
+      <w:r>
+        <w:t>r khoảng 39 chiều. Mạng gồm ba tầng ẩn lần lượt 128, 64 và 32 nơ-ron. Mỗi tầng thực hiện Linear, ReLU, Batch Normalization và Dropout 0,3; tầng cuối có một nơ-ron sinh logit, sau đó hàm sigmoid chuyển logit thành xác suất tấn công. Kiến trúc được cài đặt b</w:t>
+      </w:r>
+      <w:r>
+        <w:t>ằng PyTorch [5] và được trình bày trong Hình 4.</w:t>
       </w:r>
     </w:p>
     <w:p>
@@ -2804,103 +3036,273 @@
               <w:ind w:firstLine="0"/>
               <w:jc w:val="center"/>
             </w:pPr>
-            <m:oMath>
-              <m:sSup>
-                <m:sSupPr/>
-                <m:e>
-                  <m:r>
-                    <m:t>z</m:t>
-                  </m:r>
-                </m:e>
-                <m:sup>
-                  <m:r>
-                    <m:t>(l)</m:t>
-                  </m:r>
-                </m:sup>
-              </m:sSup>
-              <m:r>
-                <m:t> = </m:t>
-              </m:r>
-              <m:sSup>
-                <m:sSupPr/>
-                <m:e>
-                  <m:r>
-                    <m:t>W</m:t>
-                  </m:r>
-                </m:e>
-                <m:sup>
-                  <m:r>
-                    <m:t>(l)</m:t>
-                  </m:r>
-                </m:sup>
-              </m:sSup>
-              <m:sSup>
-                <m:sSupPr/>
-                <m:e>
-                  <m:r>
-                    <m:t>a</m:t>
-                  </m:r>
-                </m:e>
-                <m:sup>
-                  <m:r>
-                    <m:t>(l−1)</m:t>
-                  </m:r>
-                </m:sup>
-              </m:sSup>
-              <m:r>
-                <m:t> + </m:t>
-              </m:r>
-              <m:sSup>
-                <m:sSupPr/>
-                <m:e>
-                  <m:r>
-                    <m:t>b</m:t>
-                  </m:r>
-                </m:e>
-                <m:sup>
-                  <m:r>
-                    <m:t>(l)</m:t>
-                  </m:r>
-                </m:sup>
-              </m:sSup>
-              <m:r>
-                <m:t>;  </m:t>
-              </m:r>
-              <m:sSup>
-                <m:sSupPr/>
-                <m:e>
-                  <m:r>
-                    <m:t>a</m:t>
-                  </m:r>
-                </m:e>
-                <m:sup>
-                  <m:r>
-                    <m:t>(l)</m:t>
-                  </m:r>
-                </m:sup>
-              </m:sSup>
-              <m:r>
-                <m:t> = ReLU</m:t>
-              </m:r>
-              <m:d>
-                <m:dPr/>
-                <m:e>
-                  <m:sSup>
-                    <m:sSupPr/>
-                    <m:e>
-                      <m:r>
-                        <m:t>z</m:t>
-                      </m:r>
-                    </m:e>
-                    <m:sup>
-                      <m:r>
-                        <m:t>(l)</m:t>
-                      </m:r>
-                    </m:sup>
-                  </m:sSup>
-                </m:e>
-              </m:d>
-            </m:oMath>
+            <m:oMathPara>
+              <m:oMath>
+                <m:sSup>
+                  <m:sSupPr>
+                    <m:ctrlPr>
+                      <w:rPr>
+                        <w:rFonts w:ascii="Cambria Math" w:hAnsi="Cambria Math"/>
+                      </w:rPr>
+                    </m:ctrlPr>
+                  </m:sSupPr>
+                  <m:e>
+                    <m:r>
+                      <w:rPr>
+                        <w:rFonts w:ascii="Cambria Math" w:hAnsi="Cambria Math"/>
+                      </w:rPr>
+                      <m:t>z</m:t>
+                    </m:r>
+                  </m:e>
+                  <m:sup>
+                    <m:r>
+                      <w:rPr>
+                        <w:rFonts w:ascii="Cambria Math" w:hAnsi="Cambria Math"/>
+                      </w:rPr>
+                      <m:t>(</m:t>
+                    </m:r>
+                    <m:r>
+                      <w:rPr>
+                        <w:rFonts w:ascii="Cambria Math" w:hAnsi="Cambria Math"/>
+                      </w:rPr>
+                      <m:t>l</m:t>
+                    </m:r>
+                    <m:r>
+                      <w:rPr>
+                        <w:rFonts w:ascii="Cambria Math" w:hAnsi="Cambria Math"/>
+                      </w:rPr>
+                      <m:t>)</m:t>
+                    </m:r>
+                  </m:sup>
+                </m:sSup>
+                <m:r>
+                  <w:rPr>
+                    <w:rFonts w:ascii="Cambria Math" w:hAnsi="Cambria Math"/>
+                  </w:rPr>
+                  <m:t xml:space="preserve"> = </m:t>
+                </m:r>
+                <m:sSup>
+                  <m:sSupPr>
+                    <m:ctrlPr>
+                      <w:rPr>
+                        <w:rFonts w:ascii="Cambria Math" w:hAnsi="Cambria Math"/>
+                      </w:rPr>
+                    </m:ctrlPr>
+                  </m:sSupPr>
+                  <m:e>
+                    <m:r>
+                      <w:rPr>
+                        <w:rFonts w:ascii="Cambria Math" w:hAnsi="Cambria Math"/>
+                      </w:rPr>
+                      <m:t>W</m:t>
+                    </m:r>
+                  </m:e>
+                  <m:sup>
+                    <m:r>
+                      <w:rPr>
+                        <w:rFonts w:ascii="Cambria Math" w:hAnsi="Cambria Math"/>
+                      </w:rPr>
+                      <m:t>(</m:t>
+                    </m:r>
+                    <m:r>
+                      <w:rPr>
+                        <w:rFonts w:ascii="Cambria Math" w:hAnsi="Cambria Math"/>
+                      </w:rPr>
+                      <m:t>l</m:t>
+                    </m:r>
+                    <m:r>
+                      <w:rPr>
+                        <w:rFonts w:ascii="Cambria Math" w:hAnsi="Cambria Math"/>
+                      </w:rPr>
+                      <m:t>)</m:t>
+                    </m:r>
+                  </m:sup>
+                </m:sSup>
+                <m:sSup>
+                  <m:sSupPr>
+                    <m:ctrlPr>
+                      <w:rPr>
+                        <w:rFonts w:ascii="Cambria Math" w:hAnsi="Cambria Math"/>
+                      </w:rPr>
+                    </m:ctrlPr>
+                  </m:sSupPr>
+                  <m:e>
+                    <m:r>
+                      <w:rPr>
+                        <w:rFonts w:ascii="Cambria Math" w:hAnsi="Cambria Math"/>
+                      </w:rPr>
+                      <m:t>a</m:t>
+                    </m:r>
+                  </m:e>
+                  <m:sup>
+                    <m:r>
+                      <w:rPr>
+                        <w:rFonts w:ascii="Cambria Math" w:hAnsi="Cambria Math"/>
+                      </w:rPr>
+                      <m:t>(</m:t>
+                    </m:r>
+                    <m:r>
+                      <w:rPr>
+                        <w:rFonts w:ascii="Cambria Math" w:hAnsi="Cambria Math"/>
+                      </w:rPr>
+                      <m:t>l</m:t>
+                    </m:r>
+                    <m:r>
+                      <w:rPr>
+                        <w:rFonts w:ascii="Cambria Math" w:hAnsi="Cambria Math"/>
+                      </w:rPr>
+                      <m:t>-1)</m:t>
+                    </m:r>
+                  </m:sup>
+                </m:sSup>
+                <m:r>
+                  <w:rPr>
+                    <w:rFonts w:ascii="Cambria Math" w:hAnsi="Cambria Math"/>
+                  </w:rPr>
+                  <m:t xml:space="preserve"> + </m:t>
+                </m:r>
+                <m:sSup>
+                  <m:sSupPr>
+                    <m:ctrlPr>
+                      <w:rPr>
+                        <w:rFonts w:ascii="Cambria Math" w:hAnsi="Cambria Math"/>
+                      </w:rPr>
+                    </m:ctrlPr>
+                  </m:sSupPr>
+                  <m:e>
+                    <m:r>
+                      <w:rPr>
+                        <w:rFonts w:ascii="Cambria Math" w:hAnsi="Cambria Math"/>
+                      </w:rPr>
+                      <m:t>b</m:t>
+                    </m:r>
+                  </m:e>
+                  <m:sup>
+                    <m:r>
+                      <w:rPr>
+                        <w:rFonts w:ascii="Cambria Math" w:hAnsi="Cambria Math"/>
+                      </w:rPr>
+                      <m:t>(</m:t>
+                    </m:r>
+                    <m:r>
+                      <w:rPr>
+                        <w:rFonts w:ascii="Cambria Math" w:hAnsi="Cambria Math"/>
+                      </w:rPr>
+                      <m:t>l</m:t>
+                    </m:r>
+                    <m:r>
+                      <w:rPr>
+                        <w:rFonts w:ascii="Cambria Math" w:hAnsi="Cambria Math"/>
+                      </w:rPr>
+                      <m:t>)</m:t>
+                    </m:r>
+                  </m:sup>
+                </m:sSup>
+                <m:r>
+                  <w:rPr>
+                    <w:rFonts w:ascii="Cambria Math" w:hAnsi="Cambria Math"/>
+                  </w:rPr>
+                  <m:t xml:space="preserve">;  </m:t>
+                </m:r>
+                <m:sSup>
+                  <m:sSupPr>
+                    <m:ctrlPr>
+                      <w:rPr>
+                        <w:rFonts w:ascii="Cambria Math" w:hAnsi="Cambria Math"/>
+                      </w:rPr>
+                    </m:ctrlPr>
+                  </m:sSupPr>
+                  <m:e>
+                    <m:r>
+                      <w:rPr>
+                        <w:rFonts w:ascii="Cambria Math" w:hAnsi="Cambria Math"/>
+                      </w:rPr>
+                      <m:t>a</m:t>
+                    </m:r>
+                  </m:e>
+                  <m:sup>
+                    <m:r>
+                      <w:rPr>
+                        <w:rFonts w:ascii="Cambria Math" w:hAnsi="Cambria Math"/>
+                      </w:rPr>
+                      <m:t>(</m:t>
+                    </m:r>
+                    <m:r>
+                      <w:rPr>
+                        <w:rFonts w:ascii="Cambria Math" w:hAnsi="Cambria Math"/>
+                      </w:rPr>
+                      <m:t>l</m:t>
+                    </m:r>
+                    <m:r>
+                      <w:rPr>
+                        <w:rFonts w:ascii="Cambria Math" w:hAnsi="Cambria Math"/>
+                      </w:rPr>
+                      <m:t>)</m:t>
+                    </m:r>
+                  </m:sup>
+                </m:sSup>
+                <m:r>
+                  <w:rPr>
+                    <w:rFonts w:ascii="Cambria Math" w:hAnsi="Cambria Math"/>
+                  </w:rPr>
+                  <m:t xml:space="preserve"> = </m:t>
+                </m:r>
+                <m:r>
+                  <w:rPr>
+                    <w:rFonts w:ascii="Cambria Math" w:hAnsi="Cambria Math"/>
+                  </w:rPr>
+                  <m:t>ReLU</m:t>
+                </m:r>
+                <m:d>
+                  <m:dPr>
+                    <m:ctrlPr>
+                      <w:rPr>
+                        <w:rFonts w:ascii="Cambria Math" w:hAnsi="Cambria Math"/>
+                      </w:rPr>
+                    </m:ctrlPr>
+                  </m:dPr>
+                  <m:e>
+                    <m:sSup>
+                      <m:sSupPr>
+                        <m:ctrlPr>
+                          <w:rPr>
+                            <w:rFonts w:ascii="Cambria Math" w:hAnsi="Cambria Math"/>
+                          </w:rPr>
+                        </m:ctrlPr>
+                      </m:sSupPr>
+                      <m:e>
+                        <m:r>
+                          <w:rPr>
+                            <w:rFonts w:ascii="Cambria Math" w:hAnsi="Cambria Math"/>
+                          </w:rPr>
+                          <m:t>z</m:t>
+                        </m:r>
+                      </m:e>
+                      <m:sup>
+                        <m:r>
+                          <w:rPr>
+                            <w:rFonts w:ascii="Cambria Math" w:hAnsi="Cambria Math"/>
+                          </w:rPr>
+                          <m:t>(</m:t>
+                        </m:r>
+                        <m:r>
+                          <w:rPr>
+                            <w:rFonts w:ascii="Cambria Math" w:hAnsi="Cambria Math"/>
+                          </w:rPr>
+                          <m:t>l</m:t>
+                        </m:r>
+                        <m:r>
+                          <w:rPr>
+                            <w:rFonts w:ascii="Cambria Math" w:hAnsi="Cambria Math"/>
+                          </w:rPr>
+                          <m:t>)</m:t>
+                        </m:r>
+                      </m:sup>
+                    </m:sSup>
+                  </m:e>
+                </m:d>
+              </m:oMath>
+            </m:oMathPara>
           </w:p>
         </w:tc>
         <w:tc>
@@ -2921,7 +3323,10 @@
     </w:tbl>
     <w:p>
       <w:r>
-        <w:t>Tầng ra sử dụng sigmoid để thu được xác suất ŷ. Hàm mất mát Binary Cross-Entropy được gán trọng số lớp dương nhằm bù mất cân bằng, với pos_weight bằng tỷ lệ số mẫu âm trên số mẫu dương. Gradient được lan truyền ngược từ tầng ra về các tầng trước, sau đó Adam cập nhật trọng số. Mô hình huấn luyện tối đa 30 epoch, batch size 4096, learning rate 10⁻³, early stopping patience 5 và chọn checkpoint có AUPRC cao nhất trên tập xác thực. Một số bước tiền xử lý và đánh giá được hỗ trợ bởi scikit-learn [4].</w:t>
+        <w:t xml:space="preserve">Tầng ra sử dụng sigmoid để thu được xác suất ŷ. Hàm mất mát Binary Cross-Entropy được gán trọng số lớp dương nhằm bù mất cân bằng, với pos_weight bằng tỷ lệ số mẫu âm trên số mẫu dương. Gradient được lan truyền ngược từ tầng ra về các tầng trước, </w:t>
+      </w:r>
+      <w:r>
+        <w:t>sau đó Adam cập nhật trọng số. Mô hình huấn luyện tối đa 30 epoch, batch size 4096, learning rate 10⁻³, early stopping patience 5 và chọn checkpoint có AUPRC cao nhất trên tập xác thực. Một số bước tiền xử lý và đánh giá được hỗ trợ bởi scikit-learn [4].</w:t>
       </w:r>
     </w:p>
     <w:p>
@@ -2929,19 +3334,34 @@
         <w:pStyle w:val="Heading2"/>
       </w:pPr>
       <w:r>
-        <w:t>2.4. Thuật toán tổng quát</w:t>
+        <w:t>2</w:t>
+      </w:r>
+      <w:r>
+        <w:t>.4. Thu</w:t>
+      </w:r>
+      <w:r>
+        <w:t>ậ</w:t>
+      </w:r>
+      <w:r>
+        <w:t>t toán t</w:t>
+      </w:r>
+      <w:r>
+        <w:t>ổ</w:t>
+      </w:r>
+      <w:r>
+        <w:t>ng quát</w:t>
       </w:r>
     </w:p>
     <w:p>
-      <w:pPr/>
       <w:r>
         <w:t>Thuật toán 1 tóm tắt liên kết đầu vào–đầu ra giữa các bước, từ nhật ký đăng nhập thô đến xác suất tấn công cuối cùng.</w:t>
       </w:r>
     </w:p>
     <w:p>
       <w:pPr>
-        <w:ind w:firstLine="0" w:left="280"/>
         <w:shd w:val="clear" w:color="auto" w:fill="F2F2F2"/>
+        <w:ind w:left="280" w:firstLine="0"/>
+        <w:jc w:val="left"/>
       </w:pPr>
       <w:r>
         <w:rPr>
@@ -2949,349 +3369,405 @@
           <w:sz w:val="18"/>
         </w:rPr>
         <w:t>Thuật toán 1  RBA-RiskScore(nhật ký đăng nhập L)</w:t>
-        <w:br/>
       </w:r>
       <w:r>
         <w:rPr>
           <w:rFonts w:ascii="Consolas" w:hAnsi="Consolas"/>
           <w:sz w:val="18"/>
         </w:rPr>
-        <w:t>Đầu vào : L = {user_id, timestamp, country, asn, device, os, browser,</w:t>
         <w:br/>
+        <w:t xml:space="preserve">Đầu vào : L = {user_id, timestamp, country, asn, device, os, </w:t>
       </w:r>
       <w:r>
         <w:rPr>
           <w:rFonts w:ascii="Consolas" w:hAnsi="Consolas"/>
           <w:sz w:val="18"/>
         </w:rPr>
-        <w:t xml:space="preserve">          login_successful, round_trip_time, ...}</w:t>
-        <w:br/>
+        <w:t>browser,</w:t>
       </w:r>
       <w:r>
         <w:rPr>
           <w:rFonts w:ascii="Consolas" w:hAnsi="Consolas"/>
           <w:sz w:val="18"/>
         </w:rPr>
-        <w:t>Đầu ra  : xác suất tấn công ŷ ∈ [0, 1]</w:t>
         <w:br/>
+        <w:t xml:space="preserve">          login_successful, round_trip_time, ...}</w:t>
       </w:r>
       <w:r>
         <w:rPr>
           <w:rFonts w:ascii="Consolas" w:hAnsi="Consolas"/>
           <w:sz w:val="18"/>
         </w:rPr>
-        <w:t xml:space="preserve"> </w:t>
         <w:br/>
+        <w:t>Đầu ra  : xác suất tấn công ŷ ∈ [0, 1]</w:t>
       </w:r>
       <w:r>
         <w:rPr>
           <w:rFonts w:ascii="Consolas" w:hAnsi="Consolas"/>
           <w:sz w:val="18"/>
         </w:rPr>
-        <w:t>Bước A. TRÍCH XUẤT ĐẶC TRƯNG(L) → F</w:t>
         <w:br/>
+        <w:t> </w:t>
       </w:r>
       <w:r>
         <w:rPr>
           <w:rFonts w:ascii="Consolas" w:hAnsi="Consolas"/>
           <w:sz w:val="18"/>
         </w:rPr>
-        <w:t xml:space="preserve">  F.thời_gian ← hour_of_day, day_of_week, is_odd_hour</w:t>
         <w:br/>
+        <w:t>Bước A. TRÍCH XUẤT ĐẶC TRƯNG(L) → F</w:t>
       </w:r>
       <w:r>
         <w:rPr>
           <w:rFonts w:ascii="Consolas" w:hAnsi="Consolas"/>
           <w:sz w:val="18"/>
         </w:rPr>
-        <w:t xml:space="preserve">  F.độ_hiếm   ← country_rarity, asn_rarity (tần suất toàn cục, fit trên train)</w:t>
         <w:br/>
+        <w:t xml:space="preserve">  F.thời_gian ← hour_of_day, day_of_week, is_odd_hour</w:t>
       </w:r>
       <w:r>
         <w:rPr>
           <w:rFonts w:ascii="Consolas" w:hAnsi="Consolas"/>
           <w:sz w:val="18"/>
         </w:rPr>
-        <w:t xml:space="preserve">  F.lịch_sử   ← is_new_country/asn/device/os, time_since_last_login_h,</w:t>
         <w:br/>
+        <w:t xml:space="preserve">  F.độ_hiếm   ← country_rarity, asn_rarity (tần suất toàn cục, fit</w:t>
       </w:r>
       <w:r>
         <w:rPr>
           <w:rFonts w:ascii="Consolas" w:hAnsi="Consolas"/>
           <w:sz w:val="18"/>
         </w:rPr>
-        <w:t xml:space="preserve">                user_success_rate_so_far, num_changes</w:t>
-        <w:br/>
+        <w:t xml:space="preserve"> trên train)</w:t>
       </w:r>
       <w:r>
         <w:rPr>
           <w:rFonts w:ascii="Consolas" w:hAnsi="Consolas"/>
           <w:sz w:val="18"/>
         </w:rPr>
-        <w:t xml:space="preserve">                (chỉ dùng sự kiện TRƯỚC thời điểm hiện tại của user)</w:t>
         <w:br/>
+        <w:t xml:space="preserve">  F.lịch_sử   ← is_new_country/asn/device/os, time_since_last_login_h,</w:t>
       </w:r>
       <w:r>
         <w:rPr>
           <w:rFonts w:ascii="Consolas" w:hAnsi="Consolas"/>
           <w:sz w:val="18"/>
         </w:rPr>
-        <w:t xml:space="preserve"> </w:t>
         <w:br/>
+        <w:t xml:space="preserve">                user_success_rate_so_far, num_changes</w:t>
       </w:r>
       <w:r>
         <w:rPr>
           <w:rFonts w:ascii="Consolas" w:hAnsi="Consolas"/>
           <w:sz w:val="18"/>
         </w:rPr>
-        <w:t>Bước B. SUY DIỄN MỜ MAMDANI(F) → Z</w:t>
         <w:br/>
+        <w:t xml:space="preserve">                (chỉ dùng sự kiện TRƯỚC thời điểm hiện tại của user)</w:t>
       </w:r>
       <w:r>
         <w:rPr>
           <w:rFonts w:ascii="Consolas" w:hAnsi="Consolas"/>
           <w:sz w:val="18"/>
         </w:rPr>
-        <w:t xml:space="preserve">  với mỗi biến liên tục v ∈ {gap, country_rarity, asn_rarity,</w:t>
         <w:br/>
+        <w:t> </w:t>
       </w:r>
       <w:r>
         <w:rPr>
           <w:rFonts w:ascii="Consolas" w:hAnsi="Consolas"/>
           <w:sz w:val="18"/>
         </w:rPr>
-        <w:t xml:space="preserve">                              success_rate, num_changes}:</w:t>
         <w:br/>
+        <w:t>Bước B. SUY DIỄN MỜ MAMDANI(F) → Z</w:t>
       </w:r>
       <w:r>
         <w:rPr>
           <w:rFonts w:ascii="Consolas" w:hAnsi="Consolas"/>
           <w:sz w:val="18"/>
         </w:rPr>
-        <w:t xml:space="preserve">        (low, med, high) ← MỜ_HÓA(v, ngưỡng percentile p20/p50/p80 trên train)</w:t>
         <w:br/>
+        <w:t xml:space="preserve">  với mỗi bi</w:t>
       </w:r>
       <w:r>
         <w:rPr>
           <w:rFonts w:ascii="Consolas" w:hAnsi="Consolas"/>
           <w:sz w:val="18"/>
         </w:rPr>
-        <w:t xml:space="preserve">  với mỗi luật Ri trong 8 luật IF-THEN (AND = min, OR = max):</w:t>
-        <w:br/>
+        <w:t>ến liên tục v ∈ {gap, country_rarity, asn_rarity,</w:t>
       </w:r>
       <w:r>
         <w:rPr>
           <w:rFonts w:ascii="Consolas" w:hAnsi="Consolas"/>
           <w:sz w:val="18"/>
         </w:rPr>
-        <w:t xml:space="preserve">        firing_i ← ĐÁNH_GIÁ(Ri, low, med, high)</w:t>
         <w:br/>
+        <w:t xml:space="preserve">                              success_rate, num_changes}:</w:t>
       </w:r>
       <w:r>
         <w:rPr>
           <w:rFonts w:ascii="Consolas" w:hAnsi="Consolas"/>
           <w:sz w:val="18"/>
         </w:rPr>
-        <w:t xml:space="preserve">  agg ← GỘP(firing_1..8, tập mờ ra Low/Medium/High)      { toán tử max }</w:t>
         <w:br/>
+        <w:t xml:space="preserve">        (low, med, high) ← MỜ_HÓA(v, ngưỡng percentile p20/p50/p80 trên train)</w:t>
       </w:r>
       <w:r>
         <w:rPr>
           <w:rFonts w:ascii="Consolas" w:hAnsi="Consolas"/>
           <w:sz w:val="18"/>
         </w:rPr>
-        <w:t xml:space="preserve">  Z.mamdani_risk_score ← GIẢI_MỜ(agg)                     { phương pháp centroid }</w:t>
         <w:br/>
+        <w:t xml:space="preserve">  với mỗi luật Ri trong 8 luật IF-THEN (AND = min, OR = max):</w:t>
       </w:r>
       <w:r>
         <w:rPr>
           <w:rFonts w:ascii="Consolas" w:hAnsi="Consolas"/>
           <w:sz w:val="18"/>
         </w:rPr>
-        <w:t xml:space="preserve">  Z.fz_* ← toàn bộ 15 giá trị độ thuộc</w:t>
         <w:br/>
+        <w:t xml:space="preserve">       </w:t>
       </w:r>
       <w:r>
         <w:rPr>
           <w:rFonts w:ascii="Consolas" w:hAnsi="Consolas"/>
           <w:sz w:val="18"/>
         </w:rPr>
-        <w:t xml:space="preserve"> </w:t>
-        <w:br/>
+        <w:t xml:space="preserve"> firing_i ← ĐÁNH_GIÁ(Ri, low, med, high)</w:t>
       </w:r>
       <w:r>
         <w:rPr>
           <w:rFonts w:ascii="Consolas" w:hAnsi="Consolas"/>
           <w:sz w:val="18"/>
         </w:rPr>
-        <w:t>Bước C. TIỀN XỬ LÝ(F, Z) → X</w:t>
         <w:br/>
+        <w:t xml:space="preserve">  agg ← GỘP(firing_1..8, tập mờ ra Low/Medium/High)      { toán tử max }</w:t>
       </w:r>
       <w:r>
         <w:rPr>
           <w:rFonts w:ascii="Consolas" w:hAnsi="Consolas"/>
           <w:sz w:val="18"/>
         </w:rPr>
-        <w:t xml:space="preserve">  chia(L) → train / val / test (70/15/15, phân tầng theo nhãn)</w:t>
         <w:br/>
+        <w:t xml:space="preserve">  Z.mamdani_risk_score ← GIẢI_MỜ(agg)                     { phương pháp centroid }</w:t>
       </w:r>
       <w:r>
         <w:rPr>
           <w:rFonts w:ascii="Consolas" w:hAnsi="Consolas"/>
           <w:sz w:val="18"/>
         </w:rPr>
-        <w:t xml:space="preserve">  scaler ← fit StandardScaler(F.số | train)</w:t>
         <w:br/>
+        <w:t xml:space="preserve">  Z.fz_* ← toàn bộ 15 giá trị độ thuộc</w:t>
       </w:r>
       <w:r>
         <w:rPr>
           <w:rFonts w:ascii="Consolas" w:hAnsi="Consolas"/>
           <w:sz w:val="18"/>
         </w:rPr>
-        <w:t xml:space="preserve">  ohe    ← fit OneHotEncoder(F.loại_thiết_bị | train)</w:t>
         <w:br/>
+        <w:t> </w:t>
       </w:r>
       <w:r>
         <w:rPr>
           <w:rFonts w:ascii="Consolas" w:hAnsi="Consolas"/>
           <w:sz w:val="18"/>
         </w:rPr>
-        <w:t xml:space="preserve">  fis    ← fit MamdaniFuzzyRiskSystem(F | train)</w:t>
         <w:br/>
+        <w:t>Bước C. TIỀN XỬ LÝ</w:t>
       </w:r>
       <w:r>
         <w:rPr>
           <w:rFonts w:ascii="Consolas" w:hAnsi="Consolas"/>
           <w:sz w:val="18"/>
         </w:rPr>
-        <w:t xml:space="preserve">  X ← ghép(scaler.transform(F.số), ohe.transform(F.loại_thiết_bị), fis.transform(F))</w:t>
-        <w:br/>
+        <w:t>(F, Z) → X</w:t>
       </w:r>
       <w:r>
         <w:rPr>
           <w:rFonts w:ascii="Consolas" w:hAnsi="Consolas"/>
           <w:sz w:val="18"/>
         </w:rPr>
-        <w:t xml:space="preserve"> </w:t>
         <w:br/>
+        <w:t xml:space="preserve">  chia(L) → train / val / test (70/15/15, phân tầng theo nhãn)</w:t>
       </w:r>
       <w:r>
         <w:rPr>
           <w:rFonts w:ascii="Consolas" w:hAnsi="Consolas"/>
           <w:sz w:val="18"/>
         </w:rPr>
-        <w:t>Bước D. LAN TRUYỀN XUÔI MLP(X) → ŷ</w:t>
         <w:br/>
+        <w:t xml:space="preserve">  scaler ← fit StandardScaler(F.số | train)</w:t>
       </w:r>
       <w:r>
         <w:rPr>
           <w:rFonts w:ascii="Consolas" w:hAnsi="Consolas"/>
           <w:sz w:val="18"/>
         </w:rPr>
-        <w:t xml:space="preserve">  h ← X</w:t>
         <w:br/>
+        <w:t xml:space="preserve">  ohe    ← fit OneHotEncoder(F.loại_thiết_bị | train)</w:t>
       </w:r>
       <w:r>
         <w:rPr>
           <w:rFonts w:ascii="Consolas" w:hAnsi="Consolas"/>
           <w:sz w:val="18"/>
         </w:rPr>
-        <w:t xml:space="preserve">  với mỗi chiều_ẩn ∈ (128, 64, 32):</w:t>
         <w:br/>
+        <w:t xml:space="preserve">  fis    ← fit MamdaniFuzzyRiskSystem(F | train)</w:t>
       </w:r>
       <w:r>
         <w:rPr>
           <w:rFonts w:ascii="Consolas" w:hAnsi="Consolas"/>
           <w:sz w:val="18"/>
         </w:rPr>
-        <w:t xml:space="preserve">        h ← Dropout(BatchNorm(ReLU(Linear(h, chiều_ẩn))))</w:t>
         <w:br/>
+        <w:t xml:space="preserve">  X ← ghép(scaler.transform(F.số), </w:t>
       </w:r>
       <w:r>
         <w:rPr>
           <w:rFonts w:ascii="Consolas" w:hAnsi="Consolas"/>
           <w:sz w:val="18"/>
         </w:rPr>
-        <w:t xml:space="preserve">  logit ← Linear(h, 1)</w:t>
-        <w:br/>
+        <w:t>ohe.transform(F.loại_thiết_bị), fis.transform(F))</w:t>
       </w:r>
       <w:r>
         <w:rPr>
           <w:rFonts w:ascii="Consolas" w:hAnsi="Consolas"/>
           <w:sz w:val="18"/>
         </w:rPr>
-        <w:t xml:space="preserve">  ŷ ← sigmoid(logit)                                       { xác suất tấn công }</w:t>
         <w:br/>
+        <w:t> </w:t>
       </w:r>
       <w:r>
         <w:rPr>
           <w:rFonts w:ascii="Consolas" w:hAnsi="Consolas"/>
           <w:sz w:val="18"/>
         </w:rPr>
-        <w:t xml:space="preserve"> </w:t>
         <w:br/>
+        <w:t>Bước D. LAN TRUYỀN XUÔI MLP(X) → ŷ</w:t>
       </w:r>
       <w:r>
         <w:rPr>
           <w:rFonts w:ascii="Consolas" w:hAnsi="Consolas"/>
           <w:sz w:val="18"/>
         </w:rPr>
-        <w:t>Bước E. HUẤN LUYỆN (chỉ ở pha huấn luyện)</w:t>
         <w:br/>
+        <w:t xml:space="preserve">  h ← X</w:t>
       </w:r>
       <w:r>
         <w:rPr>
           <w:rFonts w:ascii="Consolas" w:hAnsi="Consolas"/>
           <w:sz w:val="18"/>
         </w:rPr>
-        <w:t xml:space="preserve">  loss ← BCEWithLogits(logit, y_thật; pos_weight = n_âm/n_dương)</w:t>
         <w:br/>
+        <w:t xml:space="preserve">  với mỗi chiều_ẩn ∈ (128, 64, 32):</w:t>
       </w:r>
       <w:r>
         <w:rPr>
           <w:rFonts w:ascii="Consolas" w:hAnsi="Consolas"/>
           <w:sz w:val="18"/>
         </w:rPr>
-        <w:t xml:space="preserve">  ∇θ ← Lan_truyền_ngược(loss)</w:t>
         <w:br/>
+        <w:t xml:space="preserve">        h ← Dropout(BatchNorm(ReLU(Linear(h, chiều_ẩn))))</w:t>
       </w:r>
       <w:r>
         <w:rPr>
           <w:rFonts w:ascii="Consolas" w:hAnsi="Consolas"/>
           <w:sz w:val="18"/>
         </w:rPr>
-        <w:t xml:space="preserve">  θ ← θ − Adam(∇θ, lr = 1e-3, weight_decay = 1e-5)</w:t>
         <w:br/>
+        <w:t xml:space="preserve">  logit ← Linear(h, 1)</w:t>
       </w:r>
       <w:r>
         <w:rPr>
           <w:rFonts w:ascii="Consolas" w:hAnsi="Consolas"/>
           <w:sz w:val="18"/>
         </w:rPr>
-        <w:t xml:space="preserve">  lặp theo mini-batch (4096 mẫu) × tối đa 30 epoch</w:t>
         <w:br/>
+        <w:t xml:space="preserve">  ŷ ← sigmoid(logit)                        </w:t>
       </w:r>
       <w:r>
         <w:rPr>
           <w:rFonts w:ascii="Consolas" w:hAnsi="Consolas"/>
           <w:sz w:val="18"/>
         </w:rPr>
-        <w:t xml:space="preserve">  dừng sớm nếu val_AUPRC không cải thiện sau 5 epoch</w:t>
-        <w:br/>
+        <w:t xml:space="preserve">               { xác suất tấn công }</w:t>
       </w:r>
       <w:r>
         <w:rPr>
           <w:rFonts w:ascii="Consolas" w:hAnsi="Consolas"/>
           <w:sz w:val="18"/>
         </w:rPr>
-        <w:t xml:space="preserve"> </w:t>
         <w:br/>
+        <w:t> </w:t>
       </w:r>
       <w:r>
         <w:rPr>
           <w:rFonts w:ascii="Consolas" w:hAnsi="Consolas"/>
           <w:sz w:val="18"/>
         </w:rPr>
+        <w:br/>
+        <w:t>Bước E. HUẤN LUYỆN (chỉ ở pha huấn luyện)</w:t>
+      </w:r>
+      <w:r>
+        <w:rPr>
+          <w:rFonts w:ascii="Consolas" w:hAnsi="Consolas"/>
+          <w:sz w:val="18"/>
+        </w:rPr>
+        <w:br/>
+        <w:t xml:space="preserve">  loss ← BCEWithLogits(logit, y_thật; pos_weight = n_âm/n_dương)</w:t>
+      </w:r>
+      <w:r>
+        <w:rPr>
+          <w:rFonts w:ascii="Consolas" w:hAnsi="Consolas"/>
+          <w:sz w:val="18"/>
+        </w:rPr>
+        <w:br/>
+        <w:t xml:space="preserve">  ∇θ ← Lan_truyền_ngược(loss)</w:t>
+      </w:r>
+      <w:r>
+        <w:rPr>
+          <w:rFonts w:ascii="Consolas" w:hAnsi="Consolas"/>
+          <w:sz w:val="18"/>
+        </w:rPr>
+        <w:br/>
+        <w:t xml:space="preserve">  θ ← θ − Adam(∇θ, lr = 1e-3, weight_decay = 1e-5)</w:t>
+      </w:r>
+      <w:r>
+        <w:rPr>
+          <w:rFonts w:ascii="Consolas" w:hAnsi="Consolas"/>
+          <w:sz w:val="18"/>
+        </w:rPr>
+        <w:br/>
+        <w:t xml:space="preserve">  lặp theo mini-batch (4096 m</w:t>
+      </w:r>
+      <w:r>
+        <w:rPr>
+          <w:rFonts w:ascii="Consolas" w:hAnsi="Consolas"/>
+          <w:sz w:val="18"/>
+        </w:rPr>
+        <w:t>ẫu) × tối đa 30 epoch</w:t>
+      </w:r>
+      <w:r>
+        <w:rPr>
+          <w:rFonts w:ascii="Consolas" w:hAnsi="Consolas"/>
+          <w:sz w:val="18"/>
+        </w:rPr>
+        <w:br/>
+        <w:t xml:space="preserve">  dừng sớm nếu val_AUPRC không cải thiện sau 5 epoch</w:t>
+      </w:r>
+      <w:r>
+        <w:rPr>
+          <w:rFonts w:ascii="Consolas" w:hAnsi="Consolas"/>
+          <w:sz w:val="18"/>
+        </w:rPr>
+        <w:br/>
+        <w:t> </w:t>
+      </w:r>
+      <w:r>
+        <w:rPr>
+          <w:rFonts w:ascii="Consolas" w:hAnsi="Consolas"/>
+          <w:sz w:val="18"/>
+        </w:rPr>
+        <w:br/>
         <w:t>Trả về ŷ = xác suất tấn công</w:t>
       </w:r>
     </w:p>
@@ -3303,6 +3779,7 @@
         <w:rPr>
           <w:rFonts w:eastAsia="Times New Roman"/>
         </w:rPr>
+        <w:lastRenderedPageBreak/>
         <w:t>3. Kết quả và bàn luận</w:t>
       </w:r>
     </w:p>
@@ -3319,7 +3796,10 @@
     </w:p>
     <w:p>
       <w:r>
-        <w:t>Tập kiểm tra gồm 75.000 bản ghi và không tham gia vào quá trình ước lượng scaler, one-hot encoder, phân vị hàm thuộc hoặc thống kê độ hiếm. Ngưỡng phân lớp mặc định là 0,5. Do lớp tấn công chỉ chiếm khoảng 3%, nghiên cứu ưu tiên AUPRC, Recall, Precision và F1 [7]; AUROC và Accuracy được báo cáo để tham khảo nhưng không được sử dụng riêng lẻ để kết luận.</w:t>
+        <w:t>Tập kiểm tra gồm 75.000 bản ghi và không tham gia vào quá trình ước lượng scaler, one-hot encoder, phân</w:t>
+      </w:r>
+      <w:r>
+        <w:t xml:space="preserve"> vị hàm thuộc hoặc thống kê độ hiếm. Ngưỡng phân lớp mặc định là 0,5. Do lớp tấn công chỉ chiếm khoảng 3%, nghiên cứu ưu tiên AUPRC, Recall, Precision và F1 [7]; AUROC và Accuracy được báo cáo để tham khảo nhưng không được sử dụng riêng lẻ để kết luận.</w:t>
       </w:r>
     </w:p>
     <w:p>
@@ -3331,12 +3811,13 @@
         <w:rPr>
           <w:b/>
         </w:rPr>
-        <w:t>Bảng 2. Kết quả của mô hình lai trên tập kiểm tra 75.000 bản ghi</w:t>
-      </w:r>
-      <w:r>
-        <w:rPr>
-          <w:i/>
-        </w:rPr>
+        <w:t>Bản</w:t>
+      </w:r>
+      <w:r>
+        <w:rPr>
+          <w:b/>
+        </w:rPr>
+        <w:t>g 2. Kết quả của mô hình lai trên tập kiểm tra 75.000 bản ghi</w:t>
       </w:r>
     </w:p>
     <w:tbl>
@@ -3678,7 +4159,13 @@
               <w:rPr>
                 <w:sz w:val="20"/>
               </w:rPr>
-              <w:t>Bị ảnh hưởng bởi lớp bình thường chiếm đa số</w:t>
+              <w:t xml:space="preserve">Bị ảnh hưởng bởi lớp bình thường chiếm đa </w:t>
+            </w:r>
+            <w:r>
+              <w:rPr>
+                <w:sz w:val="20"/>
+              </w:rPr>
+              <w:t>số</w:t>
             </w:r>
           </w:p>
         </w:tc>
@@ -3953,7 +4440,19 @@
         <w:rPr>
           <w:lang w:val="en-US"/>
         </w:rPr>
-        <w:t>Bảng 2 và Hình 5 cho thấy mô hình đạt Recall 0,843 nhưng Precision chỉ 0,114. Đây là đánh đổi có chủ đích trong kịch bản RBA: bỏ sót tấn công có thể gây hậu quả nghiêm trọng, trong khi báo động giả chủ yếu dẫn đến yêu cầu xác thực bổ sung. Ma trận nhầm lẫn ghi nhận 1.936 true positive, 360 false negative, 14.991 false positive và 57.713 true negative. Như vậy, mô hình bắt được phần lớn tấn công nhưng tạo số lượng cảnh báo giả đáng kể.</w:t>
+        <w:t xml:space="preserve">Bảng 2 và Hình 5 cho thấy mô hình đạt Recall 0,843 nhưng Precision chỉ </w:t>
+      </w:r>
+      <w:r>
+        <w:rPr>
+          <w:lang w:val="en-US"/>
+        </w:rPr>
+        <w:t>0,114. Đây là đánh đổi có chủ đích trong kịch bản RBA: bỏ sót tấn công có thể gây hậu quả nghiêm trọng, trong khi báo động giả chủ yếu dẫn đến yêu cầu xác thực bổ sung. Ma trận nhầm lẫn ghi nhận 1.936 true positive, 360 false negative, 14.991 false positiv</w:t>
+      </w:r>
+      <w:r>
+        <w:rPr>
+          <w:lang w:val="en-US"/>
+        </w:rPr>
+        <w:t>e và 57.713 true negative. Như vậy, mô hình bắt được phần lớn tấn công nhưng tạo số lượng cảnh báo giả đáng kể.</w:t>
       </w:r>
     </w:p>
     <w:p>
@@ -3966,7 +4465,13 @@
         <w:rPr>
           <w:lang w:val="en-US"/>
         </w:rPr>
-        <w:t>AUPRC 0,216 có ý nghĩa hơn Accuracy 0,795 đối với dữ liệu lệch lớp. So với baseline ngẫu nhiên xấp xỉ tỷ lệ dương 0,03, AUPRC tăng hơn bảy lần, cho thấy mô hình thực sự xếp hạng các mẫu tấn công tốt hơn ngẫu nhiên. AUROC 0,877 xác nhận khả năng tách lớp tổng quát, nhưng đường Precision–Recall phản ánh rõ hơn sự suy giảm Precision khi cố gắng mở rộng Recall.</w:t>
+        <w:t xml:space="preserve">AUPRC 0,216 có ý nghĩa hơn Accuracy 0,795 đối với dữ liệu lệch lớp. So với baseline ngẫu nhiên xấp xỉ tỷ lệ dương 0,03, AUPRC tăng hơn bảy lần, </w:t>
+      </w:r>
+      <w:r>
+        <w:rPr>
+          <w:lang w:val="en-US"/>
+        </w:rPr>
+        <w:t>cho thấy mô hình thực sự xếp hạng các mẫu tấn công tốt hơn ngẫu nhiên. AUROC 0,877 xác nhận khả năng tách lớp tổng quát, nhưng đường Precision–Recall phản ánh rõ hơn sự suy giảm Precision khi cố gắng mở rộng Recall.</w:t>
       </w:r>
     </w:p>
     <w:p>
@@ -4034,12 +4539,21 @@
         <w:rPr>
           <w:i/>
         </w:rPr>
-        <w:t>Kết quả đánh giá: (a) các chỉ số trên tập kiểm tra; (b) đường ROC và Precision–Recall; (c) ma trận nhầm lẫn.</w:t>
+        <w:t xml:space="preserve">Kết quả đánh giá: (a) các chỉ </w:t>
+      </w:r>
+      <w:r>
+        <w:rPr>
+          <w:i/>
+        </w:rPr>
+        <w:t>số trên tập kiểm tra; (b) đường ROC và Precision–Recall; (c) ma trận nhầm lẫn.</w:t>
       </w:r>
     </w:p>
     <w:p>
       <w:r>
-        <w:t>Khi tối ưu ngưỡng theo F1, ngưỡng khoảng 0,856 có thể nâng Precision lên khoảng 28,9% nếu chấp nhận giảm Recall. Vì vậy, ngưỡng triển khai nên được lựa chọn theo ma trận chi phí thực tế: hệ thống ưu tiên an toàn có thể giữ ngưỡng thấp để giảm bỏ sót; hệ thống nhạy với trải nghiệm người dùng có thể tăng ngưỡng để giảm số lần yêu cầu xác thực bổ sung.</w:t>
+        <w:t>Khi tối ưu ngưỡng theo F1, ngưỡng khoảng 0,856 có thể nâng Precision lên khoảng 28,9% nếu chấp nhận giảm Recall. Vì vậy, ngưỡng triển khai nên được lựa chọn theo ma trận chi phí</w:t>
+      </w:r>
+      <w:r>
+        <w:t xml:space="preserve"> thực tế: hệ thống ưu tiên an toàn có thể giữ ngưỡng thấp để giảm bỏ sót; hệ thống nhạy với trải nghiệm người dùng có thể tăng ngưỡng để giảm số lần yêu cầu xác thực bổ sung.</w:t>
       </w:r>
     </w:p>
     <w:p>
@@ -4051,9 +4565,14 @@
       </w:r>
     </w:p>
     <w:p>
-      <w:pPr/>
-      <w:r>
-        <w:t>Để kiểm chứng đóng góp thực sự của nhánh Mamdani FIS, nhóm huấn luyện lại cùng kiến trúc MLP, cùng cách chia tập train/val/test và cùng seed, nhưng loại bỏ toàn bộ 16 đặc trưng mờ (15 mức độ thuộc và mamdani_risk_score) khỏi đầu vào. Nếu biến thể có đặc trưng mờ vượt trội, đó là bằng chứng cho thấy nhánh Mamdani mang lại tín hiệu mà MLP không tự trích xuất được tốt bằng chỉ từ đặc trưng số thô.</w:t>
+      <w:r>
+        <w:t>Để kiểm chứng đóng góp thực sự của nhánh Mamdani FIS, nhóm hu</w:t>
+      </w:r>
+      <w:r>
+        <w:t>ấn luyện lại cùng kiến trúc MLP, cùng cách chia tập train/val/test và cùng seed, nhưng loại bỏ toàn bộ 16 đặc trưng mờ (15 mức độ thuộc và mamdani_risk_score) khỏi đầu vào. Nếu biến thể có đặc trưng mờ vượt trội, đó là bằng chứng cho thấy nhánh Mamdani man</w:t>
+      </w:r>
+      <w:r>
+        <w:t>g lại tín hiệu mà MLP không tự trích xuất được tốt bằng chỉ từ đặc trưng số thô.</w:t>
       </w:r>
     </w:p>
     <w:p>
@@ -4076,20 +4595,20 @@
     </w:p>
     <w:tbl>
       <w:tblPr>
-        <w:tblW w:type="dxa" w:w="9071"/>
-        <w:tblLook w:firstColumn="1" w:firstRow="1" w:lastColumn="0" w:lastRow="0" w:noHBand="0" w:noVBand="1" w:val="04A0"/>
-        <w:tblLayout w:type="fixed"/>
+        <w:tblW w:w="9071" w:type="dxa"/>
         <w:tblBorders>
           <w:top w:val="single" w:sz="4" w:space="0" w:color="000000"/>
+          <w:left w:val="nil"/>
           <w:bottom w:val="single" w:sz="4" w:space="0" w:color="000000"/>
+          <w:right w:val="nil"/>
           <w:insideH w:val="single" w:sz="4" w:space="0" w:color="000000"/>
-          <w:left w:val="nil"/>
-          <w:right w:val="nil"/>
           <w:insideV w:val="nil"/>
         </w:tblBorders>
+        <w:tblLayout w:type="fixed"/>
+        <w:tblLook w:val="04A0" w:firstRow="1" w:lastRow="0" w:firstColumn="1" w:lastColumn="0" w:noHBand="0" w:noVBand="1"/>
       </w:tblPr>
       <w:tblGrid>
-        <w:gridCol w:w="2268"/>
+        <w:gridCol w:w="2267"/>
         <w:gridCol w:w="2268"/>
         <w:gridCol w:w="2268"/>
         <w:gridCol w:w="2268"/>
@@ -4097,7 +4616,7 @@
       <w:tr>
         <w:tc>
           <w:tcPr>
-            <w:tcW w:type="dxa" w:w="2268"/>
+            <w:tcW w:w="2268" w:type="dxa"/>
           </w:tcPr>
           <w:p>
             <w:pPr>
@@ -4114,7 +4633,7 @@
         </w:tc>
         <w:tc>
           <w:tcPr>
-            <w:tcW w:type="dxa" w:w="2268"/>
+            <w:tcW w:w="2268" w:type="dxa"/>
           </w:tcPr>
           <w:p>
             <w:pPr>
@@ -4131,7 +4650,7 @@
         </w:tc>
         <w:tc>
           <w:tcPr>
-            <w:tcW w:type="dxa" w:w="2268"/>
+            <w:tcW w:w="2268" w:type="dxa"/>
           </w:tcPr>
           <w:p>
             <w:pPr>
@@ -4148,7 +4667,7 @@
         </w:tc>
         <w:tc>
           <w:tcPr>
-            <w:tcW w:type="dxa" w:w="2268"/>
+            <w:tcW w:w="2268" w:type="dxa"/>
           </w:tcPr>
           <w:p>
             <w:pPr>
@@ -4167,7 +4686,7 @@
       <w:tr>
         <w:tc>
           <w:tcPr>
-            <w:tcW w:type="dxa" w:w="2268"/>
+            <w:tcW w:w="2268" w:type="dxa"/>
           </w:tcPr>
           <w:p>
             <w:pPr>
@@ -4183,7 +4702,7 @@
         </w:tc>
         <w:tc>
           <w:tcPr>
-            <w:tcW w:type="dxa" w:w="2268"/>
+            <w:tcW w:w="2268" w:type="dxa"/>
           </w:tcPr>
           <w:p>
             <w:pPr>
@@ -4199,7 +4718,7 @@
         </w:tc>
         <w:tc>
           <w:tcPr>
-            <w:tcW w:type="dxa" w:w="2268"/>
+            <w:tcW w:w="2268" w:type="dxa"/>
           </w:tcPr>
           <w:p>
             <w:pPr>
@@ -4215,7 +4734,7 @@
         </w:tc>
         <w:tc>
           <w:tcPr>
-            <w:tcW w:type="dxa" w:w="2268"/>
+            <w:tcW w:w="2268" w:type="dxa"/>
           </w:tcPr>
           <w:p>
             <w:pPr>
@@ -4233,7 +4752,7 @@
       <w:tr>
         <w:tc>
           <w:tcPr>
-            <w:tcW w:type="dxa" w:w="2268"/>
+            <w:tcW w:w="2268" w:type="dxa"/>
           </w:tcPr>
           <w:p>
             <w:pPr>
@@ -4243,13 +4762,14 @@
               <w:rPr>
                 <w:sz w:val="20"/>
               </w:rPr>
+              <w:lastRenderedPageBreak/>
               <w:t>AUPRC</w:t>
             </w:r>
           </w:p>
         </w:tc>
         <w:tc>
           <w:tcPr>
-            <w:tcW w:type="dxa" w:w="2268"/>
+            <w:tcW w:w="2268" w:type="dxa"/>
           </w:tcPr>
           <w:p>
             <w:pPr>
@@ -4265,7 +4785,7 @@
         </w:tc>
         <w:tc>
           <w:tcPr>
-            <w:tcW w:type="dxa" w:w="2268"/>
+            <w:tcW w:w="2268" w:type="dxa"/>
           </w:tcPr>
           <w:p>
             <w:pPr>
@@ -4281,7 +4801,7 @@
         </w:tc>
         <w:tc>
           <w:tcPr>
-            <w:tcW w:type="dxa" w:w="2268"/>
+            <w:tcW w:w="2268" w:type="dxa"/>
           </w:tcPr>
           <w:p>
             <w:pPr>
@@ -4299,7 +4819,7 @@
       <w:tr>
         <w:tc>
           <w:tcPr>
-            <w:tcW w:type="dxa" w:w="2268"/>
+            <w:tcW w:w="2268" w:type="dxa"/>
           </w:tcPr>
           <w:p>
             <w:pPr>
@@ -4315,7 +4835,7 @@
         </w:tc>
         <w:tc>
           <w:tcPr>
-            <w:tcW w:type="dxa" w:w="2268"/>
+            <w:tcW w:w="2268" w:type="dxa"/>
           </w:tcPr>
           <w:p>
             <w:pPr>
@@ -4331,7 +4851,7 @@
         </w:tc>
         <w:tc>
           <w:tcPr>
-            <w:tcW w:type="dxa" w:w="2268"/>
+            <w:tcW w:w="2268" w:type="dxa"/>
           </w:tcPr>
           <w:p>
             <w:pPr>
@@ -4347,7 +4867,7 @@
         </w:tc>
         <w:tc>
           <w:tcPr>
-            <w:tcW w:type="dxa" w:w="2268"/>
+            <w:tcW w:w="2268" w:type="dxa"/>
           </w:tcPr>
           <w:p>
             <w:pPr>
@@ -4365,7 +4885,7 @@
       <w:tr>
         <w:tc>
           <w:tcPr>
-            <w:tcW w:type="dxa" w:w="2268"/>
+            <w:tcW w:w="2268" w:type="dxa"/>
           </w:tcPr>
           <w:p>
             <w:pPr>
@@ -4381,7 +4901,7 @@
         </w:tc>
         <w:tc>
           <w:tcPr>
-            <w:tcW w:type="dxa" w:w="2268"/>
+            <w:tcW w:w="2268" w:type="dxa"/>
           </w:tcPr>
           <w:p>
             <w:pPr>
@@ -4397,7 +4917,7 @@
         </w:tc>
         <w:tc>
           <w:tcPr>
-            <w:tcW w:type="dxa" w:w="2268"/>
+            <w:tcW w:w="2268" w:type="dxa"/>
           </w:tcPr>
           <w:p>
             <w:pPr>
@@ -4413,7 +4933,7 @@
         </w:tc>
         <w:tc>
           <w:tcPr>
-            <w:tcW w:type="dxa" w:w="2268"/>
+            <w:tcW w:w="2268" w:type="dxa"/>
           </w:tcPr>
           <w:p>
             <w:pPr>
@@ -4431,7 +4951,7 @@
       <w:tr>
         <w:tc>
           <w:tcPr>
-            <w:tcW w:type="dxa" w:w="2268"/>
+            <w:tcW w:w="2268" w:type="dxa"/>
           </w:tcPr>
           <w:p>
             <w:pPr>
@@ -4447,7 +4967,7 @@
         </w:tc>
         <w:tc>
           <w:tcPr>
-            <w:tcW w:type="dxa" w:w="2268"/>
+            <w:tcW w:w="2268" w:type="dxa"/>
           </w:tcPr>
           <w:p>
             <w:pPr>
@@ -4463,7 +4983,7 @@
         </w:tc>
         <w:tc>
           <w:tcPr>
-            <w:tcW w:type="dxa" w:w="2268"/>
+            <w:tcW w:w="2268" w:type="dxa"/>
           </w:tcPr>
           <w:p>
             <w:pPr>
@@ -4479,7 +4999,7 @@
         </w:tc>
         <w:tc>
           <w:tcPr>
-            <w:tcW w:type="dxa" w:w="2268"/>
+            <w:tcW w:w="2268" w:type="dxa"/>
           </w:tcPr>
           <w:p>
             <w:pPr>
@@ -4497,7 +5017,7 @@
       <w:tr>
         <w:tc>
           <w:tcPr>
-            <w:tcW w:type="dxa" w:w="2268"/>
+            <w:tcW w:w="2268" w:type="dxa"/>
           </w:tcPr>
           <w:p>
             <w:pPr>
@@ -4513,7 +5033,7 @@
         </w:tc>
         <w:tc>
           <w:tcPr>
-            <w:tcW w:type="dxa" w:w="2268"/>
+            <w:tcW w:w="2268" w:type="dxa"/>
           </w:tcPr>
           <w:p>
             <w:pPr>
@@ -4529,7 +5049,7 @@
         </w:tc>
         <w:tc>
           <w:tcPr>
-            <w:tcW w:type="dxa" w:w="2268"/>
+            <w:tcW w:w="2268" w:type="dxa"/>
           </w:tcPr>
           <w:p>
             <w:pPr>
@@ -4545,7 +5065,7 @@
         </w:tc>
         <w:tc>
           <w:tcPr>
-            <w:tcW w:type="dxa" w:w="2268"/>
+            <w:tcW w:w="2268" w:type="dxa"/>
           </w:tcPr>
           <w:p>
             <w:pPr>
@@ -4562,19 +5082,30 @@
       </w:tr>
     </w:tbl>
     <w:p>
-      <w:pPr/>
-      <w:r>
-        <w:t>Kết quả cho thấy nhánh Mamdani FIS mang lại cải thiện nhất quán trên toàn bộ sáu chỉ số, rõ nhất ở Recall (+0,0144) và AUPRC (+0,0100) — hai chỉ số quan trọng nhất đối với dữ liệu lệch lớp. Điều này hợp lý vì các đặc trưng mờ về bản chất là hàm phi tuyến tường minh của cùng những biến thô mà MLP đã có sẵn trong đầu vào; MLP có thể tự học một phần các quan hệ phi tuyến này, nhưng việc mã hoá sẵn tri thức chuyên gia qua 8 luật IF-THEN giúp mô hình hội tụ tới tín hiệu rủi ro rõ ràng hơn, đặc biệt cải thiện khả năng phát hiện tấn công (Recall) — chỉ số quan trọng nhất trong bài toán RBA.</w:t>
+      <w:r>
+        <w:t xml:space="preserve">Kết quả cho thấy nhánh Mamdani FIS mang lại cải thiện nhất quán trên toàn bộ sáu chỉ số, rõ nhất ở Recall </w:t>
+      </w:r>
+      <w:r>
+        <w:t>(+0,0144) và AUPRC (+0,0100) — hai chỉ số quan trọng nhất đối với dữ liệu lệch lớp. Điều này hợp lý vì các đặc trưng mờ về bản chất là hàm phi tuyến tường minh của cùng những biến thô mà MLP đã có sẵn trong đầu vào; MLP có thể tự học một phần các quan hệ p</w:t>
+      </w:r>
+      <w:r>
+        <w:t>hi tuyến này, nhưng việc mã hoá sẵn tri thức chuyên gia qua 8 luật IF-THEN giúp mô hình hội tụ tới tín hiệu rủi ro rõ ràng hơn, đặc biệt cải thiện khả năng phát hiện tấn công (Recall) — chỉ số quan trọng nhất trong bài toán RBA.</w:t>
       </w:r>
     </w:p>
     <w:p>
-      <w:pPr/>
       <w:r>
         <w:rPr>
           <w:i/>
           <w:sz w:val="20"/>
         </w:rPr>
-        <w:t>Lưu ý: thực nghiệm ablation được chạy trên cùng bộ dữ liệu, cùng cách chia tập và cùng seed với kết quả chính thức ở Bảng 2, nên cột MLP + Mamdani FIS khớp với các số ở Bảng 2.</w:t>
+        <w:t>Lưu ý: thực nghiệm ablation</w:t>
+      </w:r>
+      <w:r>
+        <w:rPr>
+          <w:i/>
+          <w:sz w:val="20"/>
+        </w:rPr>
+        <w:t xml:space="preserve"> được chạy trên cùng bộ dữ liệu, cùng cách chia tập và cùng seed với kết quả chính thức ở Bảng 2, nên cột MLP + Mamdani FIS khớp với các số ở Bảng 2.</w:t>
       </w:r>
     </w:p>
     <w:p>
@@ -4590,12 +5121,20 @@
     </w:p>
     <w:p>
       <w:r>
-        <w:t>Điểm mạnh của kiến trúc lai là hệ mờ cung cấp dấu vết giải thích trước khi MLP ra quyết định. Với một mẫu cụ thể, người quản trị có thể quan sát biến nào thuộc mức High và luật nào kích hoạt mạnh, chẳng hạn ASN hiếm, tỷ lệ thành công thấp hoặc nhiều thuộc tính thay đổi. MLP tiếp tục học tương tác phi tuyến giữa các bằng chứng này với đặc trưng số và thiết bị, do đó hai thành phần bổ trợ thay vì cạnh tranh.</w:t>
+        <w:t>Điểm mạnh của mô hình kết hợp là hệ mờ giúp giải thích vì sao một lượt đăng nhập bị đánh giá là nguy hiểm. Đối với từng lượt đăng nhập, người quản trị có thể xem yếu tố nào đang ở mức rủi ro cao và luật nào được kích hoạt. Ví dụ, hệ thống có thể phát hiện ASN ít xuất hiện, tỷ lệ đăng nhập thành công trước đây thấp hoặc có nhiều thông tin thay đổi so với lần đăng nhập gần nhất. Sau đó, mạng MLP kết hợp các dấu hiệu này với các đặc trưng khác để đưa ra kết quả phân loại cuối cùng. Vì vậy, hệ mờ giúp thể hiện các dấu hiệu rủi ro một cách dễ hiểu, còn MLP giúp học các mối quan hệ phức tạp trong dữ liệu.</w:t>
       </w:r>
     </w:p>
     <w:p>
       <w:r>
-        <w:t>Nghiên cứu còn ba hạn chế. Thứ nhất, Precision ở ngưỡng 0,5 thấp và có thể làm tăng ma sát xác thực. Thứ hai, tám luật mờ được thiết kế thủ công nên chưa chắc tối ưu cho mọi tổ chức hoặc mọi giai đoạn dữ liệu. Thứ ba, kết quả hiện tại mới đánh giá trên một bộ dữ liệu và chưa có thử nghiệm theo thời gian thực. Trong quá trình triển khai, nhóm đã khắc phục hai lỗi quan trọng: miền xmin/xmax của hệ mờ từng bị tính lại theo từng batch và một số thống kê toàn cục từng được ước lượng ngoài tập huấn luyện; cả hai đã được sửa để bảo đảm suy diễn nhất quán và tránh rò rỉ dữ liệu.</w:t>
+        <w:t>Nghiên cứu vẫn còn một số hạn chế. Thứ nhất, tại ngưỡng phân loại 0,5, Precision của mô hình còn thấp nên hệ thống tạo ra nhiều cảnh báo sai. Điều này có thể khiến người dùng phải thực hiện xác thực bổ sung dù lượt đăng nhập thực tế không phải là tấn công. Thứ hai, tám luật mờ hiện được thiết kế thủ công dựa trên nhận định của nhóm, vì vậy các luật này chưa chắc phù hợp với mọi hệ thống hoặc mọi bộ dữ liệu. Thứ ba, mô hình mới được đánh giá trên một bộ dữ liệu và chưa được thử nghiệm trực tiếp trên luồng đăng nhập thực tế theo thời gian.</w:t>
+      </w:r>
+    </w:p>
+    <w:p>
+      <w:r>
+        <w:t>Trong quá trình xây dựng mô hình, nhóm cũng phát hiện và sửa hai lỗi quan trọng. Lỗi thứ nhất là phạm vi giá trị nhỏ nhất và lớn nhất của hệ mờ từng được tính lại theo từng nhóm dữ liệu, làm điểm rủi ro của cùng một lượt đăng nhập có thể thay đổi. Sau khi sửa, các giá trị này được cố định từ tập huấn luyện. Lỗi thứ hai là một số thông tin thống kê từng được tính từ cả dữ liệu kiểm tra, có thể làm kết quả đánh giá cao hơn thực tế. Nhóm đã sửa bằng cách chỉ tính các thông tin này trên tập huấn luyện, sau đó áp dụng cho tập xác thực và tập kiểm tra</w:t>
+      </w:r>
+      <w:r>
+        <w:t>.</w:t>
       </w:r>
     </w:p>
     <w:p>
@@ -4606,18 +5145,29 @@
         <w:rPr>
           <w:rFonts w:eastAsia="Times New Roman"/>
         </w:rPr>
-        <w:lastRenderedPageBreak/>
         <w:t>4. Kết luận</w:t>
       </w:r>
     </w:p>
     <w:p>
       <w:r>
-        <w:t>Nghiên cứu đã xây dựng mô hình lai MLP và hệ suy diễn mờ Mamdani cho bài toán phát hiện đăng nhập rủi ro trên khoảng 500.000 bản ghi. Hệ mờ chuyển tri thức chuyên gia thành 16 đặc trưng có khả năng giải thích và một điểm rủi ro tổng hợp; MLP ba tầng ẩn học quan hệ phi tuyến để phân loại cuối cùng. Trên tập kiểm tra 75.000 dòng, mô hình đạt AUROC 0,877, AUPRC 0,216 và Recall 0,843, cho thấy khả năng phát hiện phần lớn lượt tấn công trong điều kiện dữ liệu mất cân bằng.</w:t>
+        <w:t>Nghiên cứu đã xây dựng mô hình kết hợp mạng nơ-ron đa tầng và hệ suy diễn mờ Mamdani để phát hiện các lượt đăng nhập có nguy cơ tấn công. Bộ dữ liệu gồm khoảng 500.000 lượt đăng nhập, trong đó số lượt tấn công chỉ chiếm khoảng 3%. Hệ mờ sử dụng tám luật IF–THEN để đánh giá các dấu hiệu bất thường và tạo ra 16 đặc trưng mờ. Các đặc trưng này được kết hợp với dữ liệu đã tiền xử lý rồi đưa vào mạng MLP có ba tầng ẩn để thực hiện phân loại cuối cùng.</w:t>
       </w:r>
     </w:p>
     <w:p>
       <w:r>
-        <w:t>Hướng phát triển tiếp theo gồm sử dụng Focal Loss, tinh chỉnh pos_weight và lựa chọn ngưỡng theo chi phí nghiệp vụ; học tự động hàm thuộc và luật bằng ANFIS [8]; hiệu chỉnh xác suất; và đánh giá mô hình trên luồng đăng nhập theo thời gian để theo dõi drift. Các cải tiến này hướng đến giảm báo động giả nhưng vẫn duy trì mức Recall phù hợp cho hệ thống RBA thực tế.</w:t>
+        <w:t>Trên tập kiểm tra gồm 75.000 lượt đăng nhập, mô hình đạt AUROC 0,877, AUPRC 0,216 và Recall 0,843. Kết quả này cho thấy mô hình có thể phát hiện được phần lớn lượt tấn công. Tuy nhiên, Precision vẫn còn thấp nên số cảnh báo sai còn nhiều. Đây là sự đánh đổi giữa việc phát hiện nhiều cuộc tấn công và việc hạn chế gây bất tiện cho người dùng.</w:t>
+      </w:r>
+    </w:p>
+    <w:p>
+      <w:r>
+        <w:t xml:space="preserve">Trong thời gian tới, nghiên cứu có thể cải thiện mô hình bằng cách thử Focal Loss, điều chỉnh trọng số lớp tấn công và chọn ngưỡng phân loại phù hợp với chi phí thực tế của hệ thống. Ngoài ra, có thể sử dụng ANFIS để mô hình tự học các hàm thuộc và luật mờ thay vì thiết kế thủ công. Mô hình cũng cần </w:t>
+      </w:r>
+      <w:r>
+        <w:lastRenderedPageBreak/>
+        <w:t>được thử nghiệm trên dữ liệu đăng nhập theo thời gian thực để đánh giá khả năng hoạt động khi hành vi người dùng và hình thức tấn công thay đổi</w:t>
+      </w:r>
+      <w:r>
+        <w:t>.</w:t>
       </w:r>
     </w:p>
     <w:p>
@@ -4634,7 +5184,10 @@
     </w:p>
     <w:p>
       <w:r>
-        <w:t xml:space="preserve">Nhóm tác giả trân trọng cảm ơn TS. </w:t>
+        <w:t>Nhóm tác g</w:t>
+      </w:r>
+      <w:r>
+        <w:t xml:space="preserve">iả trân trọng cảm ơn TS. </w:t>
       </w:r>
       <w:r>
         <w:t xml:space="preserve">Phan Thị Huyền Trang </w:t>
@@ -4674,7 +5227,10 @@
     </w:p>
     <w:p>
       <w:r>
-        <w:t>Dữ liệu hỗ trợ cho các kết quả của nghiên cứu này sẽ được nhóm tác giả cung cấp khi có yêu cầu hợp lý, phù hợp với điều kiện sử dụng của bộ dữ liệu gốc.</w:t>
+        <w:t>Dữ liệu hỗ trợ cho các kế</w:t>
+      </w:r>
+      <w:r>
+        <w:t>t quả của nghiên cứu này sẽ được nhóm tác giả cung cấp khi có yêu cầu hợp lý, phù hợp với điều kiện sử dụng của bộ dữ liệu gốc.</w:t>
       </w:r>
     </w:p>
     <w:p>
@@ -4704,7 +5260,13 @@
         <w:rPr>
           <w:lang w:val="en-US"/>
         </w:rPr>
-        <w:t xml:space="preserve">[1] S. Wiefling, L. Lo Iacono, and M. Dürmuth, “Is This Really You? An Empirical Study on Risk-Based Authentication Applied in the Wild,” in Proc. </w:t>
+        <w:t>[1] S. Wiefling, L. Lo Iacono, and M. Dürmuth, “Is This Really You? An Empirical Study on Risk-Based Authenti</w:t>
+      </w:r>
+      <w:r>
+        <w:rPr>
+          <w:lang w:val="en-US"/>
+        </w:rPr>
+        <w:t xml:space="preserve">cation Applied in the Wild,” in Proc. </w:t>
       </w:r>
       <w:r>
         <w:rPr>
@@ -4724,7 +5286,13 @@
         <w:rPr>
           <w:lang w:val="en-US"/>
         </w:rPr>
-        <w:t>[2] E. H. Mamdani and S. Assilian, “An experiment in linguistic synthesis with a fuzzy logic controller,” Int. J. Man-Machine Stud., vol. 7, no. 1, pp. 1–13, 1975.</w:t>
+        <w:t xml:space="preserve">[2] E. H. Mamdani and S. Assilian, “An experiment in linguistic synthesis with a fuzzy logic controller,” Int. J. Man-Machine Stud., vol. 7, no. 1, </w:t>
+      </w:r>
+      <w:r>
+        <w:rPr>
+          <w:lang w:val="en-US"/>
+        </w:rPr>
+        <w:t>pp. 1–13, 1975.</w:t>
       </w:r>
     </w:p>
     <w:p>
@@ -4778,7 +5346,13 @@
         <w:rPr>
           <w:lang w:val="en-US"/>
         </w:rPr>
-        <w:t>[5] A. Paszke et al., “PyTorch: An Imperative Style, High-Performance Deep Learning Library,” in Advances in Neural Information Processing Systems 32, 2019, pp. 8024–8035.</w:t>
+        <w:t>[5] A. Paszke et al</w:t>
+      </w:r>
+      <w:r>
+        <w:rPr>
+          <w:lang w:val="en-US"/>
+        </w:rPr>
+        <w:t>., “PyTorch: An Imperative Style, High-Performance Deep Learning Library,” in Advances in Neural Information Processing Systems 32, 2019, pp. 8024–8035.</w:t>
       </w:r>
     </w:p>
     <w:p>
@@ -4789,8 +5363,10 @@
         </w:rPr>
       </w:pPr>
       <w:r>
-        <w:rPr/>
-        <w:t>[6] D. Freeman, S. Jain, M. Dürmuth, B. Biggio, and G. Giacinto, “Who Are You? A Statistical Approach to Measuring User Authenticity,” in Proc. Netw. Distrib. Syst. Secur. Symp. (NDSS), 2016, doi: 10.14722/ndss.2016.23240.</w:t>
+        <w:t>[6] D. Freeman, S. Jain, M. Dürmuth, B. Biggio, and G. Giacinto, “Who Are You? A Statistical Approach t</w:t>
+      </w:r>
+      <w:r>
+        <w:t>o Measuring User Authenticity,” in Proc. Netw. Distrib. Syst. Secur. Symp. (NDSS), 2016, doi: 10.14722/ndss.2016.23240.</w:t>
       </w:r>
     </w:p>
     <w:p>
@@ -4801,8 +5377,10 @@
         </w:rPr>
       </w:pPr>
       <w:r>
-        <w:rPr/>
-        <w:t>[7] T. Saito and M. Rehmsmeier, “The Precision-Recall Plot Is More Informative than the ROC Plot When Evaluating Binary Classifiers on Imbalanced Datasets,” PLOS ONE, vol. 10, no. 3, e0118432, 2015, doi: 10.1371/journal.pone.0118432.</w:t>
+        <w:t>[7] T. Saito and M. Rehmsmeier, “The Precision-Recall Plot Is More Informative than the ROC Plot When Evaluating Binary Classifiers on I</w:t>
+      </w:r>
+      <w:r>
+        <w:t>mbalanced Datasets,” PLOS ONE, vol. 10, no. 3, e0118432, 2015, doi: 10.1371/journal.pone.0118432.</w:t>
       </w:r>
     </w:p>
     <w:p>
@@ -4813,8 +5391,10 @@
         </w:rPr>
       </w:pPr>
       <w:r>
-        <w:rPr/>
-        <w:t>[8] J.-S. R. Jang, “ANFIS: Adaptive-Network-Based Fuzzy Inference System,” IEEE Trans. Syst., Man, Cybern., vol. 23, no. 3, pp. 665-685, 1993, doi: 10.1109/21.256541.</w:t>
+        <w:t>[8] J.-S. R. Jang, “ANFIS: Adaptive-Network-Based Fuzzy Inference System,” IEEE Trans. Syst., Man, Cybern., vol. 23, no. 3, pp. 665-685, 1993, doi: 10.1109/21</w:t>
+      </w:r>
+      <w:r>
+        <w:t>.256541.</w:t>
       </w:r>
     </w:p>
     <w:p>
@@ -4965,7 +5545,14 @@
                 <w:sz w:val="18"/>
                 <w:lang w:val="en-US"/>
               </w:rPr>
-              <w:t>is a student at Ho Chi Minh City University of Technology and Education, Vietnam. Interests: applied machine learning</w:t>
+              <w:t>is a student at Ho Chi</w:t>
+            </w:r>
+            <w:r>
+              <w:rPr>
+                <w:sz w:val="18"/>
+                <w:lang w:val="en-US"/>
+              </w:rPr>
+              <w:t xml:space="preserve"> Minh City University of Technology and Education, Vietnam. Interests: applied machine learning</w:t>
             </w:r>
             <w:r>
               <w:rPr>
@@ -5021,7 +5608,7 @@
 </file>
 
 <file path=word/endnotes.xml><?xml version="1.0" encoding="utf-8"?>
-<w:endnotes xmlns:wpc="http://schemas.microsoft.com/office/word/2010/wordprocessingCanvas" xmlns:cx="http://schemas.microsoft.com/office/drawing/2014/chartex" xmlns:cx1="http://schemas.microsoft.com/office/drawing/2015/9/8/chartex" xmlns:cx2="http://schemas.microsoft.com/office/drawing/2015/10/21/chartex" xmlns:cx3="http://schemas.microsoft.com/office/drawing/2016/5/9/chartex" xmlns:cx4="http://schemas.microsoft.com/office/drawing/2016/5/10/chartex" xmlns:cx5="http://schemas.microsoft.com/office/drawing/2016/5/11/chartex" xmlns:cx6="http://schemas.microsoft.com/office/drawing/2016/5/12/chartex" xmlns:cx7="http://schemas.microsoft.com/office/drawing/2016/5/13/chartex" xmlns:cx8="http://schemas.microsoft.com/office/drawing/2016/5/14/chartex" xmlns:mc="http://schemas.openxmlformats.org/markup-compatibility/2006" xmlns:aink="http://schemas.microsoft.com/office/drawing/2016/ink" xmlns:am3d="http://schemas.microsoft.com/office/drawing/2017/model3d" xmlns:o="urn:schemas-microsoft-com:office:office" xmlns:oel="http://schemas.microsoft.com/office/2019/extlst" xmlns:r="http://schemas.openxmlformats.org/officeDocument/2006/relationships" xmlns:m="http://schemas.openxmlformats.org/officeDocument/2006/math" xmlns:v="urn:schemas-microsoft-com:vml" xmlns:wp14="http://schemas.microsoft.com/office/word/2010/wordprocessingDrawing" xmlns:wp="http://schemas.openxmlformats.org/drawingml/2006/wordprocessingDrawing" xmlns:w10="urn:schemas-microsoft-com:office:word" xmlns:w="http://schemas.openxmlformats.org/wordprocessingml/2006/main" xmlns:w14="http://schemas.microsoft.com/office/word/2010/wordml" xmlns:w15="http://schemas.microsoft.com/office/word/2012/wordml" xmlns:w16cex="http://schemas.microsoft.com/office/word/2018/wordml/cex" xmlns:w16cid="http://schemas.microsoft.com/office/word/2016/wordml/cid" xmlns:w16="http://schemas.microsoft.com/office/word/2018/wordml" xmlns:w16du="http://schemas.microsoft.com/office/word/2023/wordml/word16du" xmlns:w16sdtdh="http://schemas.microsoft.com/office/word/2020/wordml/sdtdatahash" xmlns:w16sdtfl="http://schemas.microsoft.com/office/word/2024/wordml/sdtformatlock" xmlns:w16se="http://schemas.microsoft.com/office/word/2015/wordml/symex" xmlns:wpg="http://schemas.microsoft.com/office/word/2010/wordprocessingGroup" xmlns:wpi="http://schemas.microsoft.com/office/word/2010/wordprocessingInk" xmlns:wne="http://schemas.microsoft.com/office/word/2006/wordml" xmlns:wps="http://schemas.microsoft.com/office/word/2010/wordprocessingShape" mc:Ignorable="w14 w15 w16se w16cid w16 w16cex w16sdtdh w16sdtfl w16du wp14">
+<w:endnotes xmlns:wpc="http://schemas.microsoft.com/office/word/2010/wordprocessingCanvas" xmlns:cx="http://schemas.microsoft.com/office/drawing/2014/chartex" xmlns:cx1="http://schemas.microsoft.com/office/drawing/2015/9/8/chartex" xmlns:cx2="http://schemas.microsoft.com/office/drawing/2015/10/21/chartex" xmlns:cx3="http://schemas.microsoft.com/office/drawing/2016/5/9/chartex" xmlns:cx4="http://schemas.microsoft.com/office/drawing/2016/5/10/chartex" xmlns:cx5="http://schemas.microsoft.com/office/drawing/2016/5/11/chartex" xmlns:cx6="http://schemas.microsoft.com/office/drawing/2016/5/12/chartex" xmlns:cx7="http://schemas.microsoft.com/office/drawing/2016/5/13/chartex" xmlns:cx8="http://schemas.microsoft.com/office/drawing/2016/5/14/chartex" xmlns:mc="http://schemas.openxmlformats.org/markup-compatibility/2006" xmlns:aink="http://schemas.microsoft.com/office/drawing/2016/ink" xmlns:am3d="http://schemas.microsoft.com/office/drawing/2017/model3d" xmlns:o="urn:schemas-microsoft-com:office:office" xmlns:r="http://schemas.openxmlformats.org/officeDocument/2006/relationships" xmlns:m="http://schemas.openxmlformats.org/officeDocument/2006/math" xmlns:v="urn:schemas-microsoft-com:vml" xmlns:wp14="http://schemas.microsoft.com/office/word/2010/wordprocessingDrawing" xmlns:wp="http://schemas.openxmlformats.org/drawingml/2006/wordprocessingDrawing" xmlns:w10="urn:schemas-microsoft-com:office:word" xmlns:w="http://schemas.openxmlformats.org/wordprocessingml/2006/main" xmlns:w14="http://schemas.microsoft.com/office/word/2010/wordml" xmlns:w15="http://schemas.microsoft.com/office/word/2012/wordml" xmlns:w16cex="http://schemas.microsoft.com/office/word/2018/wordml/cex" xmlns:w16cid="http://schemas.microsoft.com/office/word/2016/wordml/cid" xmlns:w16="http://schemas.microsoft.com/office/word/2018/wordml" xmlns:w16sdtdh="http://schemas.microsoft.com/office/word/2020/wordml/sdtdatahash" xmlns:w16se="http://schemas.microsoft.com/office/word/2015/wordml/symex" xmlns:wpg="http://schemas.microsoft.com/office/word/2010/wordprocessingGroup" xmlns:wpi="http://schemas.microsoft.com/office/word/2010/wordprocessingInk" xmlns:wne="http://schemas.microsoft.com/office/word/2006/wordml" xmlns:wps="http://schemas.microsoft.com/office/word/2010/wordprocessingShape" mc:Ignorable="w14 w15 w16se w16cid w16 w16cex w16sdtdh wp14">
   <w:endnote w:type="separator" w:id="-1">
     <w:p>
       <w:r>
@@ -5040,7 +5627,7 @@
 </file>
 
 <file path=word/footer1.xml><?xml version="1.0" encoding="utf-8"?>
-<w:ftr xmlns:wpc="http://schemas.microsoft.com/office/word/2010/wordprocessingCanvas" xmlns:cx="http://schemas.microsoft.com/office/drawing/2014/chartex" xmlns:cx1="http://schemas.microsoft.com/office/drawing/2015/9/8/chartex" xmlns:cx2="http://schemas.microsoft.com/office/drawing/2015/10/21/chartex" xmlns:cx3="http://schemas.microsoft.com/office/drawing/2016/5/9/chartex" xmlns:cx4="http://schemas.microsoft.com/office/drawing/2016/5/10/chartex" xmlns:cx5="http://schemas.microsoft.com/office/drawing/2016/5/11/chartex" xmlns:cx6="http://schemas.microsoft.com/office/drawing/2016/5/12/chartex" xmlns:cx7="http://schemas.microsoft.com/office/drawing/2016/5/13/chartex" xmlns:cx8="http://schemas.microsoft.com/office/drawing/2016/5/14/chartex" xmlns:mc="http://schemas.openxmlformats.org/markup-compatibility/2006" xmlns:aink="http://schemas.microsoft.com/office/drawing/2016/ink" xmlns:am3d="http://schemas.microsoft.com/office/drawing/2017/model3d" xmlns:o="urn:schemas-microsoft-com:office:office" xmlns:oel="http://schemas.microsoft.com/office/2019/extlst" xmlns:r="http://schemas.openxmlformats.org/officeDocument/2006/relationships" xmlns:m="http://schemas.openxmlformats.org/officeDocument/2006/math" xmlns:v="urn:schemas-microsoft-com:vml" xmlns:wp14="http://schemas.microsoft.com/office/word/2010/wordprocessingDrawing" xmlns:wp="http://schemas.openxmlformats.org/drawingml/2006/wordprocessingDrawing" xmlns:w10="urn:schemas-microsoft-com:office:word" xmlns:w="http://schemas.openxmlformats.org/wordprocessingml/2006/main" xmlns:w14="http://schemas.microsoft.com/office/word/2010/wordml" xmlns:w15="http://schemas.microsoft.com/office/word/2012/wordml" xmlns:w16cex="http://schemas.microsoft.com/office/word/2018/wordml/cex" xmlns:w16cid="http://schemas.microsoft.com/office/word/2016/wordml/cid" xmlns:w16="http://schemas.microsoft.com/office/word/2018/wordml" xmlns:w16du="http://schemas.microsoft.com/office/word/2023/wordml/word16du" xmlns:w16sdtdh="http://schemas.microsoft.com/office/word/2020/wordml/sdtdatahash" xmlns:w16sdtfl="http://schemas.microsoft.com/office/word/2024/wordml/sdtformatlock" xmlns:w16se="http://schemas.microsoft.com/office/word/2015/wordml/symex" xmlns:wpg="http://schemas.microsoft.com/office/word/2010/wordprocessingGroup" xmlns:wpi="http://schemas.microsoft.com/office/word/2010/wordprocessingInk" xmlns:wne="http://schemas.microsoft.com/office/word/2006/wordml" xmlns:wps="http://schemas.microsoft.com/office/word/2010/wordprocessingShape" mc:Ignorable="w14 w15 w16se w16cid w16 w16cex w16sdtdh w16sdtfl w16du wp14">
+<w:ftr xmlns:wpc="http://schemas.microsoft.com/office/word/2010/wordprocessingCanvas" xmlns:cx="http://schemas.microsoft.com/office/drawing/2014/chartex" xmlns:cx1="http://schemas.microsoft.com/office/drawing/2015/9/8/chartex" xmlns:cx2="http://schemas.microsoft.com/office/drawing/2015/10/21/chartex" xmlns:cx3="http://schemas.microsoft.com/office/drawing/2016/5/9/chartex" xmlns:cx4="http://schemas.microsoft.com/office/drawing/2016/5/10/chartex" xmlns:cx5="http://schemas.microsoft.com/office/drawing/2016/5/11/chartex" xmlns:cx6="http://schemas.microsoft.com/office/drawing/2016/5/12/chartex" xmlns:cx7="http://schemas.microsoft.com/office/drawing/2016/5/13/chartex" xmlns:cx8="http://schemas.microsoft.com/office/drawing/2016/5/14/chartex" xmlns:mc="http://schemas.openxmlformats.org/markup-compatibility/2006" xmlns:aink="http://schemas.microsoft.com/office/drawing/2016/ink" xmlns:am3d="http://schemas.microsoft.com/office/drawing/2017/model3d" xmlns:o="urn:schemas-microsoft-com:office:office" xmlns:r="http://schemas.openxmlformats.org/officeDocument/2006/relationships" xmlns:m="http://schemas.openxmlformats.org/officeDocument/2006/math" xmlns:v="urn:schemas-microsoft-com:vml" xmlns:wp14="http://schemas.microsoft.com/office/word/2010/wordprocessingDrawing" xmlns:wp="http://schemas.openxmlformats.org/drawingml/2006/wordprocessingDrawing" xmlns:w10="urn:schemas-microsoft-com:office:word" xmlns:w="http://schemas.openxmlformats.org/wordprocessingml/2006/main" xmlns:w14="http://schemas.microsoft.com/office/word/2010/wordml" xmlns:w15="http://schemas.microsoft.com/office/word/2012/wordml" xmlns:w16cex="http://schemas.microsoft.com/office/word/2018/wordml/cex" xmlns:w16cid="http://schemas.microsoft.com/office/word/2016/wordml/cid" xmlns:w16="http://schemas.microsoft.com/office/word/2018/wordml" xmlns:w16sdtdh="http://schemas.microsoft.com/office/word/2020/wordml/sdtdatahash" xmlns:w16se="http://schemas.microsoft.com/office/word/2015/wordml/symex" xmlns:wpg="http://schemas.microsoft.com/office/word/2010/wordprocessingGroup" xmlns:wpi="http://schemas.microsoft.com/office/word/2010/wordprocessingInk" xmlns:wne="http://schemas.microsoft.com/office/word/2006/wordml" xmlns:wps="http://schemas.microsoft.com/office/word/2010/wordprocessingShape" mc:Ignorable="w14 w15 w16se w16cid w16 w16cex w16sdtdh wp14">
   <w:p>
     <w:pPr>
       <w:pBdr>
@@ -5104,7 +5691,7 @@
 </file>
 
 <file path=word/footer2.xml><?xml version="1.0" encoding="utf-8"?>
-<w:ftr xmlns:wpc="http://schemas.microsoft.com/office/word/2010/wordprocessingCanvas" xmlns:cx="http://schemas.microsoft.com/office/drawing/2014/chartex" xmlns:cx1="http://schemas.microsoft.com/office/drawing/2015/9/8/chartex" xmlns:cx2="http://schemas.microsoft.com/office/drawing/2015/10/21/chartex" xmlns:cx3="http://schemas.microsoft.com/office/drawing/2016/5/9/chartex" xmlns:cx4="http://schemas.microsoft.com/office/drawing/2016/5/10/chartex" xmlns:cx5="http://schemas.microsoft.com/office/drawing/2016/5/11/chartex" xmlns:cx6="http://schemas.microsoft.com/office/drawing/2016/5/12/chartex" xmlns:cx7="http://schemas.microsoft.com/office/drawing/2016/5/13/chartex" xmlns:cx8="http://schemas.microsoft.com/office/drawing/2016/5/14/chartex" xmlns:mc="http://schemas.openxmlformats.org/markup-compatibility/2006" xmlns:aink="http://schemas.microsoft.com/office/drawing/2016/ink" xmlns:am3d="http://schemas.microsoft.com/office/drawing/2017/model3d" xmlns:o="urn:schemas-microsoft-com:office:office" xmlns:oel="http://schemas.microsoft.com/office/2019/extlst" xmlns:r="http://schemas.openxmlformats.org/officeDocument/2006/relationships" xmlns:m="http://schemas.openxmlformats.org/officeDocument/2006/math" xmlns:v="urn:schemas-microsoft-com:vml" xmlns:wp14="http://schemas.microsoft.com/office/word/2010/wordprocessingDrawing" xmlns:wp="http://schemas.openxmlformats.org/drawingml/2006/wordprocessingDrawing" xmlns:w10="urn:schemas-microsoft-com:office:word" xmlns:w="http://schemas.openxmlformats.org/wordprocessingml/2006/main" xmlns:w14="http://schemas.microsoft.com/office/word/2010/wordml" xmlns:w15="http://schemas.microsoft.com/office/word/2012/wordml" xmlns:w16cex="http://schemas.microsoft.com/office/word/2018/wordml/cex" xmlns:w16cid="http://schemas.microsoft.com/office/word/2016/wordml/cid" xmlns:w16="http://schemas.microsoft.com/office/word/2018/wordml" xmlns:w16du="http://schemas.microsoft.com/office/word/2023/wordml/word16du" xmlns:w16sdtdh="http://schemas.microsoft.com/office/word/2020/wordml/sdtdatahash" xmlns:w16sdtfl="http://schemas.microsoft.com/office/word/2024/wordml/sdtformatlock" xmlns:w16se="http://schemas.microsoft.com/office/word/2015/wordml/symex" xmlns:wpg="http://schemas.microsoft.com/office/word/2010/wordprocessingGroup" xmlns:wpi="http://schemas.microsoft.com/office/word/2010/wordprocessingInk" xmlns:wne="http://schemas.microsoft.com/office/word/2006/wordml" xmlns:wps="http://schemas.microsoft.com/office/word/2010/wordprocessingShape" mc:Ignorable="w14 w15 w16se w16cid w16 w16cex w16sdtdh w16sdtfl w16du wp14">
+<w:ftr xmlns:wpc="http://schemas.microsoft.com/office/word/2010/wordprocessingCanvas" xmlns:cx="http://schemas.microsoft.com/office/drawing/2014/chartex" xmlns:cx1="http://schemas.microsoft.com/office/drawing/2015/9/8/chartex" xmlns:cx2="http://schemas.microsoft.com/office/drawing/2015/10/21/chartex" xmlns:cx3="http://schemas.microsoft.com/office/drawing/2016/5/9/chartex" xmlns:cx4="http://schemas.microsoft.com/office/drawing/2016/5/10/chartex" xmlns:cx5="http://schemas.microsoft.com/office/drawing/2016/5/11/chartex" xmlns:cx6="http://schemas.microsoft.com/office/drawing/2016/5/12/chartex" xmlns:cx7="http://schemas.microsoft.com/office/drawing/2016/5/13/chartex" xmlns:cx8="http://schemas.microsoft.com/office/drawing/2016/5/14/chartex" xmlns:mc="http://schemas.openxmlformats.org/markup-compatibility/2006" xmlns:aink="http://schemas.microsoft.com/office/drawing/2016/ink" xmlns:am3d="http://schemas.microsoft.com/office/drawing/2017/model3d" xmlns:o="urn:schemas-microsoft-com:office:office" xmlns:r="http://schemas.openxmlformats.org/officeDocument/2006/relationships" xmlns:m="http://schemas.openxmlformats.org/officeDocument/2006/math" xmlns:v="urn:schemas-microsoft-com:vml" xmlns:wp14="http://schemas.microsoft.com/office/word/2010/wordprocessingDrawing" xmlns:wp="http://schemas.openxmlformats.org/drawingml/2006/wordprocessingDrawing" xmlns:w10="urn:schemas-microsoft-com:office:word" xmlns:w="http://schemas.openxmlformats.org/wordprocessingml/2006/main" xmlns:w14="http://schemas.microsoft.com/office/word/2010/wordml" xmlns:w15="http://schemas.microsoft.com/office/word/2012/wordml" xmlns:w16cex="http://schemas.microsoft.com/office/word/2018/wordml/cex" xmlns:w16cid="http://schemas.microsoft.com/office/word/2016/wordml/cid" xmlns:w16="http://schemas.microsoft.com/office/word/2018/wordml" xmlns:w16sdtdh="http://schemas.microsoft.com/office/word/2020/wordml/sdtdatahash" xmlns:w16se="http://schemas.microsoft.com/office/word/2015/wordml/symex" xmlns:wpg="http://schemas.microsoft.com/office/word/2010/wordprocessingGroup" xmlns:wpi="http://schemas.microsoft.com/office/word/2010/wordprocessingInk" xmlns:wne="http://schemas.microsoft.com/office/word/2006/wordml" xmlns:wps="http://schemas.microsoft.com/office/word/2010/wordprocessingShape" mc:Ignorable="w14 w15 w16se w16cid w16 w16cex w16sdtdh wp14">
   <w:p>
     <w:pPr>
       <w:widowControl w:val="0"/>
@@ -5316,7 +5903,7 @@
 </file>
 
 <file path=word/footnotes.xml><?xml version="1.0" encoding="utf-8"?>
-<w:footnotes xmlns:wpc="http://schemas.microsoft.com/office/word/2010/wordprocessingCanvas" xmlns:cx="http://schemas.microsoft.com/office/drawing/2014/chartex" xmlns:cx1="http://schemas.microsoft.com/office/drawing/2015/9/8/chartex" xmlns:cx2="http://schemas.microsoft.com/office/drawing/2015/10/21/chartex" xmlns:cx3="http://schemas.microsoft.com/office/drawing/2016/5/9/chartex" xmlns:cx4="http://schemas.microsoft.com/office/drawing/2016/5/10/chartex" xmlns:cx5="http://schemas.microsoft.com/office/drawing/2016/5/11/chartex" xmlns:cx6="http://schemas.microsoft.com/office/drawing/2016/5/12/chartex" xmlns:cx7="http://schemas.microsoft.com/office/drawing/2016/5/13/chartex" xmlns:cx8="http://schemas.microsoft.com/office/drawing/2016/5/14/chartex" xmlns:mc="http://schemas.openxmlformats.org/markup-compatibility/2006" xmlns:aink="http://schemas.microsoft.com/office/drawing/2016/ink" xmlns:am3d="http://schemas.microsoft.com/office/drawing/2017/model3d" xmlns:o="urn:schemas-microsoft-com:office:office" xmlns:oel="http://schemas.microsoft.com/office/2019/extlst" xmlns:r="http://schemas.openxmlformats.org/officeDocument/2006/relationships" xmlns:m="http://schemas.openxmlformats.org/officeDocument/2006/math" xmlns:v="urn:schemas-microsoft-com:vml" xmlns:wp14="http://schemas.microsoft.com/office/word/2010/wordprocessingDrawing" xmlns:wp="http://schemas.openxmlformats.org/drawingml/2006/wordprocessingDrawing" xmlns:w10="urn:schemas-microsoft-com:office:word" xmlns:w="http://schemas.openxmlformats.org/wordprocessingml/2006/main" xmlns:w14="http://schemas.microsoft.com/office/word/2010/wordml" xmlns:w15="http://schemas.microsoft.com/office/word/2012/wordml" xmlns:w16cex="http://schemas.microsoft.com/office/word/2018/wordml/cex" xmlns:w16cid="http://schemas.microsoft.com/office/word/2016/wordml/cid" xmlns:w16="http://schemas.microsoft.com/office/word/2018/wordml" xmlns:w16du="http://schemas.microsoft.com/office/word/2023/wordml/word16du" xmlns:w16sdtdh="http://schemas.microsoft.com/office/word/2020/wordml/sdtdatahash" xmlns:w16sdtfl="http://schemas.microsoft.com/office/word/2024/wordml/sdtformatlock" xmlns:w16se="http://schemas.microsoft.com/office/word/2015/wordml/symex" xmlns:wpg="http://schemas.microsoft.com/office/word/2010/wordprocessingGroup" xmlns:wpi="http://schemas.microsoft.com/office/word/2010/wordprocessingInk" xmlns:wne="http://schemas.microsoft.com/office/word/2006/wordml" xmlns:wps="http://schemas.microsoft.com/office/word/2010/wordprocessingShape" mc:Ignorable="w14 w15 w16se w16cid w16 w16cex w16sdtdh w16sdtfl w16du wp14">
+<w:footnotes xmlns:wpc="http://schemas.microsoft.com/office/word/2010/wordprocessingCanvas" xmlns:cx="http://schemas.microsoft.com/office/drawing/2014/chartex" xmlns:cx1="http://schemas.microsoft.com/office/drawing/2015/9/8/chartex" xmlns:cx2="http://schemas.microsoft.com/office/drawing/2015/10/21/chartex" xmlns:cx3="http://schemas.microsoft.com/office/drawing/2016/5/9/chartex" xmlns:cx4="http://schemas.microsoft.com/office/drawing/2016/5/10/chartex" xmlns:cx5="http://schemas.microsoft.com/office/drawing/2016/5/11/chartex" xmlns:cx6="http://schemas.microsoft.com/office/drawing/2016/5/12/chartex" xmlns:cx7="http://schemas.microsoft.com/office/drawing/2016/5/13/chartex" xmlns:cx8="http://schemas.microsoft.com/office/drawing/2016/5/14/chartex" xmlns:mc="http://schemas.openxmlformats.org/markup-compatibility/2006" xmlns:aink="http://schemas.microsoft.com/office/drawing/2016/ink" xmlns:am3d="http://schemas.microsoft.com/office/drawing/2017/model3d" xmlns:o="urn:schemas-microsoft-com:office:office" xmlns:r="http://schemas.openxmlformats.org/officeDocument/2006/relationships" xmlns:m="http://schemas.openxmlformats.org/officeDocument/2006/math" xmlns:v="urn:schemas-microsoft-com:vml" xmlns:wp14="http://schemas.microsoft.com/office/word/2010/wordprocessingDrawing" xmlns:wp="http://schemas.openxmlformats.org/drawingml/2006/wordprocessingDrawing" xmlns:w10="urn:schemas-microsoft-com:office:word" xmlns:w="http://schemas.openxmlformats.org/wordprocessingml/2006/main" xmlns:w14="http://schemas.microsoft.com/office/word/2010/wordml" xmlns:w15="http://schemas.microsoft.com/office/word/2012/wordml" xmlns:w16cex="http://schemas.microsoft.com/office/word/2018/wordml/cex" xmlns:w16cid="http://schemas.microsoft.com/office/word/2016/wordml/cid" xmlns:w16="http://schemas.microsoft.com/office/word/2018/wordml" xmlns:w16sdtdh="http://schemas.microsoft.com/office/word/2020/wordml/sdtdatahash" xmlns:w16se="http://schemas.microsoft.com/office/word/2015/wordml/symex" xmlns:wpg="http://schemas.microsoft.com/office/word/2010/wordprocessingGroup" xmlns:wpi="http://schemas.microsoft.com/office/word/2010/wordprocessingInk" xmlns:wne="http://schemas.microsoft.com/office/word/2006/wordml" xmlns:wps="http://schemas.microsoft.com/office/word/2010/wordprocessingShape" mc:Ignorable="w14 w15 w16se w16cid w16 w16cex w16sdtdh wp14">
   <w:footnote w:type="separator" w:id="-1">
     <w:p>
       <w:r>
@@ -5335,7 +5922,7 @@
 </file>
 
 <file path=word/header1.xml><?xml version="1.0" encoding="utf-8"?>
-<w:hdr xmlns:wpc="http://schemas.microsoft.com/office/word/2010/wordprocessingCanvas" xmlns:cx="http://schemas.microsoft.com/office/drawing/2014/chartex" xmlns:cx1="http://schemas.microsoft.com/office/drawing/2015/9/8/chartex" xmlns:cx2="http://schemas.microsoft.com/office/drawing/2015/10/21/chartex" xmlns:cx3="http://schemas.microsoft.com/office/drawing/2016/5/9/chartex" xmlns:cx4="http://schemas.microsoft.com/office/drawing/2016/5/10/chartex" xmlns:cx5="http://schemas.microsoft.com/office/drawing/2016/5/11/chartex" xmlns:cx6="http://schemas.microsoft.com/office/drawing/2016/5/12/chartex" xmlns:cx7="http://schemas.microsoft.com/office/drawing/2016/5/13/chartex" xmlns:cx8="http://schemas.microsoft.com/office/drawing/2016/5/14/chartex" xmlns:mc="http://schemas.openxmlformats.org/markup-compatibility/2006" xmlns:aink="http://schemas.microsoft.com/office/drawing/2016/ink" xmlns:am3d="http://schemas.microsoft.com/office/drawing/2017/model3d" xmlns:o="urn:schemas-microsoft-com:office:office" xmlns:oel="http://schemas.microsoft.com/office/2019/extlst" xmlns:r="http://schemas.openxmlformats.org/officeDocument/2006/relationships" xmlns:m="http://schemas.openxmlformats.org/officeDocument/2006/math" xmlns:v="urn:schemas-microsoft-com:vml" xmlns:wp14="http://schemas.microsoft.com/office/word/2010/wordprocessingDrawing" xmlns:wp="http://schemas.openxmlformats.org/drawingml/2006/wordprocessingDrawing" xmlns:w10="urn:schemas-microsoft-com:office:word" xmlns:w="http://schemas.openxmlformats.org/wordprocessingml/2006/main" xmlns:w14="http://schemas.microsoft.com/office/word/2010/wordml" xmlns:w15="http://schemas.microsoft.com/office/word/2012/wordml" xmlns:w16cex="http://schemas.microsoft.com/office/word/2018/wordml/cex" xmlns:w16cid="http://schemas.microsoft.com/office/word/2016/wordml/cid" xmlns:w16="http://schemas.microsoft.com/office/word/2018/wordml" xmlns:w16du="http://schemas.microsoft.com/office/word/2023/wordml/word16du" xmlns:w16sdtdh="http://schemas.microsoft.com/office/word/2020/wordml/sdtdatahash" xmlns:w16sdtfl="http://schemas.microsoft.com/office/word/2024/wordml/sdtformatlock" xmlns:w16se="http://schemas.microsoft.com/office/word/2015/wordml/symex" xmlns:wpg="http://schemas.microsoft.com/office/word/2010/wordprocessingGroup" xmlns:wpi="http://schemas.microsoft.com/office/word/2010/wordprocessingInk" xmlns:wne="http://schemas.microsoft.com/office/word/2006/wordml" xmlns:wps="http://schemas.microsoft.com/office/word/2010/wordprocessingShape" mc:Ignorable="w14 w15 w16se w16cid w16 w16cex w16sdtdh w16sdtfl w16du wp14">
+<w:hdr xmlns:wpc="http://schemas.microsoft.com/office/word/2010/wordprocessingCanvas" xmlns:cx="http://schemas.microsoft.com/office/drawing/2014/chartex" xmlns:cx1="http://schemas.microsoft.com/office/drawing/2015/9/8/chartex" xmlns:cx2="http://schemas.microsoft.com/office/drawing/2015/10/21/chartex" xmlns:cx3="http://schemas.microsoft.com/office/drawing/2016/5/9/chartex" xmlns:cx4="http://schemas.microsoft.com/office/drawing/2016/5/10/chartex" xmlns:cx5="http://schemas.microsoft.com/office/drawing/2016/5/11/chartex" xmlns:cx6="http://schemas.microsoft.com/office/drawing/2016/5/12/chartex" xmlns:cx7="http://schemas.microsoft.com/office/drawing/2016/5/13/chartex" xmlns:cx8="http://schemas.microsoft.com/office/drawing/2016/5/14/chartex" xmlns:mc="http://schemas.openxmlformats.org/markup-compatibility/2006" xmlns:aink="http://schemas.microsoft.com/office/drawing/2016/ink" xmlns:am3d="http://schemas.microsoft.com/office/drawing/2017/model3d" xmlns:o="urn:schemas-microsoft-com:office:office" xmlns:r="http://schemas.openxmlformats.org/officeDocument/2006/relationships" xmlns:m="http://schemas.openxmlformats.org/officeDocument/2006/math" xmlns:v="urn:schemas-microsoft-com:vml" xmlns:wp14="http://schemas.microsoft.com/office/word/2010/wordprocessingDrawing" xmlns:wp="http://schemas.openxmlformats.org/drawingml/2006/wordprocessingDrawing" xmlns:w10="urn:schemas-microsoft-com:office:word" xmlns:w="http://schemas.openxmlformats.org/wordprocessingml/2006/main" xmlns:w14="http://schemas.microsoft.com/office/word/2010/wordml" xmlns:w15="http://schemas.microsoft.com/office/word/2012/wordml" xmlns:w16cex="http://schemas.microsoft.com/office/word/2018/wordml/cex" xmlns:w16cid="http://schemas.microsoft.com/office/word/2016/wordml/cid" xmlns:w16="http://schemas.microsoft.com/office/word/2018/wordml" xmlns:w16sdtdh="http://schemas.microsoft.com/office/word/2020/wordml/sdtdatahash" xmlns:w16se="http://schemas.microsoft.com/office/word/2015/wordml/symex" xmlns:wpg="http://schemas.microsoft.com/office/word/2010/wordprocessingGroup" xmlns:wpi="http://schemas.microsoft.com/office/word/2010/wordprocessingInk" xmlns:wne="http://schemas.microsoft.com/office/word/2006/wordml" xmlns:wps="http://schemas.microsoft.com/office/word/2010/wordprocessingShape" mc:Ignorable="w14 w15 w16se w16cid w16 w16cex w16sdtdh wp14">
   <w:p>
     <w:pPr>
       <w:widowControl w:val="0"/>
@@ -5482,7 +6069,7 @@
 </file>
 
 <file path=word/header2.xml><?xml version="1.0" encoding="utf-8"?>
-<w:hdr xmlns:wpc="http://schemas.microsoft.com/office/word/2010/wordprocessingCanvas" xmlns:cx="http://schemas.microsoft.com/office/drawing/2014/chartex" xmlns:cx1="http://schemas.microsoft.com/office/drawing/2015/9/8/chartex" xmlns:cx2="http://schemas.microsoft.com/office/drawing/2015/10/21/chartex" xmlns:cx3="http://schemas.microsoft.com/office/drawing/2016/5/9/chartex" xmlns:cx4="http://schemas.microsoft.com/office/drawing/2016/5/10/chartex" xmlns:cx5="http://schemas.microsoft.com/office/drawing/2016/5/11/chartex" xmlns:cx6="http://schemas.microsoft.com/office/drawing/2016/5/12/chartex" xmlns:cx7="http://schemas.microsoft.com/office/drawing/2016/5/13/chartex" xmlns:cx8="http://schemas.microsoft.com/office/drawing/2016/5/14/chartex" xmlns:mc="http://schemas.openxmlformats.org/markup-compatibility/2006" xmlns:aink="http://schemas.microsoft.com/office/drawing/2016/ink" xmlns:am3d="http://schemas.microsoft.com/office/drawing/2017/model3d" xmlns:o="urn:schemas-microsoft-com:office:office" xmlns:oel="http://schemas.microsoft.com/office/2019/extlst" xmlns:r="http://schemas.openxmlformats.org/officeDocument/2006/relationships" xmlns:m="http://schemas.openxmlformats.org/officeDocument/2006/math" xmlns:v="urn:schemas-microsoft-com:vml" xmlns:wp14="http://schemas.microsoft.com/office/word/2010/wordprocessingDrawing" xmlns:wp="http://schemas.openxmlformats.org/drawingml/2006/wordprocessingDrawing" xmlns:w10="urn:schemas-microsoft-com:office:word" xmlns:w="http://schemas.openxmlformats.org/wordprocessingml/2006/main" xmlns:w14="http://schemas.microsoft.com/office/word/2010/wordml" xmlns:w15="http://schemas.microsoft.com/office/word/2012/wordml" xmlns:w16cex="http://schemas.microsoft.com/office/word/2018/wordml/cex" xmlns:w16cid="http://schemas.microsoft.com/office/word/2016/wordml/cid" xmlns:w16="http://schemas.microsoft.com/office/word/2018/wordml" xmlns:w16du="http://schemas.microsoft.com/office/word/2023/wordml/word16du" xmlns:w16sdtdh="http://schemas.microsoft.com/office/word/2020/wordml/sdtdatahash" xmlns:w16sdtfl="http://schemas.microsoft.com/office/word/2024/wordml/sdtformatlock" xmlns:w16se="http://schemas.microsoft.com/office/word/2015/wordml/symex" xmlns:wpg="http://schemas.microsoft.com/office/word/2010/wordprocessingGroup" xmlns:wpi="http://schemas.microsoft.com/office/word/2010/wordprocessingInk" xmlns:wne="http://schemas.microsoft.com/office/word/2006/wordml" xmlns:wps="http://schemas.microsoft.com/office/word/2010/wordprocessingShape" mc:Ignorable="w14 w15 w16se w16cid w16 w16cex w16sdtdh w16sdtfl w16du wp14">
+<w:hdr xmlns:wpc="http://schemas.microsoft.com/office/word/2010/wordprocessingCanvas" xmlns:cx="http://schemas.microsoft.com/office/drawing/2014/chartex" xmlns:cx1="http://schemas.microsoft.com/office/drawing/2015/9/8/chartex" xmlns:cx2="http://schemas.microsoft.com/office/drawing/2015/10/21/chartex" xmlns:cx3="http://schemas.microsoft.com/office/drawing/2016/5/9/chartex" xmlns:cx4="http://schemas.microsoft.com/office/drawing/2016/5/10/chartex" xmlns:cx5="http://schemas.microsoft.com/office/drawing/2016/5/11/chartex" xmlns:cx6="http://schemas.microsoft.com/office/drawing/2016/5/12/chartex" xmlns:cx7="http://schemas.microsoft.com/office/drawing/2016/5/13/chartex" xmlns:cx8="http://schemas.microsoft.com/office/drawing/2016/5/14/chartex" xmlns:mc="http://schemas.openxmlformats.org/markup-compatibility/2006" xmlns:aink="http://schemas.microsoft.com/office/drawing/2016/ink" xmlns:am3d="http://schemas.microsoft.com/office/drawing/2017/model3d" xmlns:o="urn:schemas-microsoft-com:office:office" xmlns:r="http://schemas.openxmlformats.org/officeDocument/2006/relationships" xmlns:m="http://schemas.openxmlformats.org/officeDocument/2006/math" xmlns:v="urn:schemas-microsoft-com:vml" xmlns:wp14="http://schemas.microsoft.com/office/word/2010/wordprocessingDrawing" xmlns:wp="http://schemas.openxmlformats.org/drawingml/2006/wordprocessingDrawing" xmlns:w10="urn:schemas-microsoft-com:office:word" xmlns:w="http://schemas.openxmlformats.org/wordprocessingml/2006/main" xmlns:w14="http://schemas.microsoft.com/office/word/2010/wordml" xmlns:w15="http://schemas.microsoft.com/office/word/2012/wordml" xmlns:w16cex="http://schemas.microsoft.com/office/word/2018/wordml/cex" xmlns:w16cid="http://schemas.microsoft.com/office/word/2016/wordml/cid" xmlns:w16="http://schemas.microsoft.com/office/word/2018/wordml" xmlns:w16sdtdh="http://schemas.microsoft.com/office/word/2020/wordml/sdtdatahash" xmlns:w16se="http://schemas.microsoft.com/office/word/2015/wordml/symex" xmlns:wpg="http://schemas.microsoft.com/office/word/2010/wordprocessingGroup" xmlns:wpi="http://schemas.microsoft.com/office/word/2010/wordprocessingInk" xmlns:wne="http://schemas.microsoft.com/office/word/2006/wordml" xmlns:wps="http://schemas.microsoft.com/office/word/2010/wordprocessingShape" mc:Ignorable="w14 w15 w16se w16cid w16 w16cex w16sdtdh wp14">
   <w:tbl>
     <w:tblPr>
       <w:tblStyle w:val="a7"/>
@@ -5752,7 +6339,7 @@
 </file>
 
 <file path=word/numbering.xml><?xml version="1.0" encoding="utf-8"?>
-<w:numbering xmlns:wpc="http://schemas.microsoft.com/office/word/2010/wordprocessingCanvas" xmlns:cx="http://schemas.microsoft.com/office/drawing/2014/chartex" xmlns:cx1="http://schemas.microsoft.com/office/drawing/2015/9/8/chartex" xmlns:cx2="http://schemas.microsoft.com/office/drawing/2015/10/21/chartex" xmlns:cx3="http://schemas.microsoft.com/office/drawing/2016/5/9/chartex" xmlns:cx4="http://schemas.microsoft.com/office/drawing/2016/5/10/chartex" xmlns:cx5="http://schemas.microsoft.com/office/drawing/2016/5/11/chartex" xmlns:cx6="http://schemas.microsoft.com/office/drawing/2016/5/12/chartex" xmlns:cx7="http://schemas.microsoft.com/office/drawing/2016/5/13/chartex" xmlns:cx8="http://schemas.microsoft.com/office/drawing/2016/5/14/chartex" xmlns:mc="http://schemas.openxmlformats.org/markup-compatibility/2006" xmlns:aink="http://schemas.microsoft.com/office/drawing/2016/ink" xmlns:am3d="http://schemas.microsoft.com/office/drawing/2017/model3d" xmlns:o="urn:schemas-microsoft-com:office:office" xmlns:oel="http://schemas.microsoft.com/office/2019/extlst" xmlns:r="http://schemas.openxmlformats.org/officeDocument/2006/relationships" xmlns:m="http://schemas.openxmlformats.org/officeDocument/2006/math" xmlns:v="urn:schemas-microsoft-com:vml" xmlns:wp14="http://schemas.microsoft.com/office/word/2010/wordprocessingDrawing" xmlns:wp="http://schemas.openxmlformats.org/drawingml/2006/wordprocessingDrawing" xmlns:w10="urn:schemas-microsoft-com:office:word" xmlns:w="http://schemas.openxmlformats.org/wordprocessingml/2006/main" xmlns:w14="http://schemas.microsoft.com/office/word/2010/wordml" xmlns:w15="http://schemas.microsoft.com/office/word/2012/wordml" xmlns:w16cex="http://schemas.microsoft.com/office/word/2018/wordml/cex" xmlns:w16cid="http://schemas.microsoft.com/office/word/2016/wordml/cid" xmlns:w16="http://schemas.microsoft.com/office/word/2018/wordml" xmlns:w16du="http://schemas.microsoft.com/office/word/2023/wordml/word16du" xmlns:w16sdtdh="http://schemas.microsoft.com/office/word/2020/wordml/sdtdatahash" xmlns:w16sdtfl="http://schemas.microsoft.com/office/word/2024/wordml/sdtformatlock" xmlns:w16se="http://schemas.microsoft.com/office/word/2015/wordml/symex" xmlns:wpg="http://schemas.microsoft.com/office/word/2010/wordprocessingGroup" xmlns:wpi="http://schemas.microsoft.com/office/word/2010/wordprocessingInk" xmlns:wne="http://schemas.microsoft.com/office/word/2006/wordml" xmlns:wps="http://schemas.microsoft.com/office/word/2010/wordprocessingShape" mc:Ignorable="w14 w15 w16se w16cid w16 w16cex w16sdtdh w16sdtfl w16du wp14">
+<w:numbering xmlns:wpc="http://schemas.microsoft.com/office/word/2010/wordprocessingCanvas" xmlns:cx="http://schemas.microsoft.com/office/drawing/2014/chartex" xmlns:cx1="http://schemas.microsoft.com/office/drawing/2015/9/8/chartex" xmlns:cx2="http://schemas.microsoft.com/office/drawing/2015/10/21/chartex" xmlns:cx3="http://schemas.microsoft.com/office/drawing/2016/5/9/chartex" xmlns:cx4="http://schemas.microsoft.com/office/drawing/2016/5/10/chartex" xmlns:cx5="http://schemas.microsoft.com/office/drawing/2016/5/11/chartex" xmlns:cx6="http://schemas.microsoft.com/office/drawing/2016/5/12/chartex" xmlns:cx7="http://schemas.microsoft.com/office/drawing/2016/5/13/chartex" xmlns:cx8="http://schemas.microsoft.com/office/drawing/2016/5/14/chartex" xmlns:mc="http://schemas.openxmlformats.org/markup-compatibility/2006" xmlns:aink="http://schemas.microsoft.com/office/drawing/2016/ink" xmlns:am3d="http://schemas.microsoft.com/office/drawing/2017/model3d" xmlns:o="urn:schemas-microsoft-com:office:office" xmlns:r="http://schemas.openxmlformats.org/officeDocument/2006/relationships" xmlns:m="http://schemas.openxmlformats.org/officeDocument/2006/math" xmlns:v="urn:schemas-microsoft-com:vml" xmlns:wp14="http://schemas.microsoft.com/office/word/2010/wordprocessingDrawing" xmlns:wp="http://schemas.openxmlformats.org/drawingml/2006/wordprocessingDrawing" xmlns:w10="urn:schemas-microsoft-com:office:word" xmlns:w="http://schemas.openxmlformats.org/wordprocessingml/2006/main" xmlns:w14="http://schemas.microsoft.com/office/word/2010/wordml" xmlns:w15="http://schemas.microsoft.com/office/word/2012/wordml" xmlns:w16cex="http://schemas.microsoft.com/office/word/2018/wordml/cex" xmlns:w16cid="http://schemas.microsoft.com/office/word/2016/wordml/cid" xmlns:w16="http://schemas.microsoft.com/office/word/2018/wordml" xmlns:w16sdtdh="http://schemas.microsoft.com/office/word/2020/wordml/sdtdatahash" xmlns:w16se="http://schemas.microsoft.com/office/word/2015/wordml/symex" xmlns:wpg="http://schemas.microsoft.com/office/word/2010/wordprocessingGroup" xmlns:wpi="http://schemas.microsoft.com/office/word/2010/wordprocessingInk" xmlns:wne="http://schemas.microsoft.com/office/word/2006/wordml" xmlns:wps="http://schemas.microsoft.com/office/word/2010/wordprocessingShape" mc:Ignorable="w14 w15 w16se w16cid w16 w16cex w16sdtdh wp14">
   <w:abstractNum w:abstractNumId="0" w15:restartNumberingAfterBreak="0">
     <w:nsid w:val="0EF45A95"/>
     <w:multiLevelType w:val="multilevel"/>
@@ -5993,17 +6580,17 @@
       </w:rPr>
     </w:lvl>
   </w:abstractNum>
-  <w:num w:numId="1" w16cid:durableId="1513491739">
+  <w:num w:numId="1">
     <w:abstractNumId w:val="0"/>
   </w:num>
-  <w:num w:numId="2" w16cid:durableId="1956936908">
+  <w:num w:numId="2">
     <w:abstractNumId w:val="1"/>
   </w:num>
 </w:numbering>
 </file>
 
 <file path=word/styles.xml><?xml version="1.0" encoding="utf-8"?>
-<w:styles xmlns:mc="http://schemas.openxmlformats.org/markup-compatibility/2006" xmlns:r="http://schemas.openxmlformats.org/officeDocument/2006/relationships" xmlns:w="http://schemas.openxmlformats.org/wordprocessingml/2006/main" xmlns:w14="http://schemas.microsoft.com/office/word/2010/wordml" xmlns:w15="http://schemas.microsoft.com/office/word/2012/wordml" xmlns:w16cex="http://schemas.microsoft.com/office/word/2018/wordml/cex" xmlns:w16cid="http://schemas.microsoft.com/office/word/2016/wordml/cid" xmlns:w16="http://schemas.microsoft.com/office/word/2018/wordml" xmlns:w16du="http://schemas.microsoft.com/office/word/2023/wordml/word16du" xmlns:w16sdtdh="http://schemas.microsoft.com/office/word/2020/wordml/sdtdatahash" xmlns:w16sdtfl="http://schemas.microsoft.com/office/word/2024/wordml/sdtformatlock" xmlns:w16se="http://schemas.microsoft.com/office/word/2015/wordml/symex" mc:Ignorable="w14 w15 w16se w16cid w16 w16cex w16sdtdh w16sdtfl w16du">
+<w:styles xmlns:mc="http://schemas.openxmlformats.org/markup-compatibility/2006" xmlns:r="http://schemas.openxmlformats.org/officeDocument/2006/relationships" xmlns:w="http://schemas.openxmlformats.org/wordprocessingml/2006/main" xmlns:w14="http://schemas.microsoft.com/office/word/2010/wordml" xmlns:w15="http://schemas.microsoft.com/office/word/2012/wordml" xmlns:w16cex="http://schemas.microsoft.com/office/word/2018/wordml/cex" xmlns:w16cid="http://schemas.microsoft.com/office/word/2016/wordml/cid" xmlns:w16="http://schemas.microsoft.com/office/word/2018/wordml" xmlns:w16sdtdh="http://schemas.microsoft.com/office/word/2020/wordml/sdtdatahash" xmlns:w16se="http://schemas.microsoft.com/office/word/2015/wordml/symex" mc:Ignorable="w14 w15 w16se w16cid w16 w16cex w16sdtdh">
   <w:docDefaults>
     <w:rPrDefault>
       <w:rPr>
@@ -7449,28 +8036,28 @@
 </file>
 
 <file path=customXml/item1.xml><?xml version="1.0" encoding="utf-8"?>
+<b:Sources xmlns:b="http://schemas.openxmlformats.org/officeDocument/2006/bibliography" xmlns="http://schemas.openxmlformats.org/officeDocument/2006/bibliography" SelectedStyle="\APASixthEditionOfficeOnline.xsl" StyleName="APA" Version="6"/>
+</file>
+
+<file path=customXml/item2.xml><?xml version="1.0" encoding="utf-8"?>
 <go:gDocsCustomXmlDataStorage xmlns:go="http://customooxmlschemas.google.com/" xmlns:r="http://schemas.openxmlformats.org/officeDocument/2006/relationships">
   <go:docsCustomData xmlns:go="http://customooxmlschemas.google.com/" roundtripDataSignature="AMtx7mhr/Qs0k/+bBxbmcnPDWlqVuImtGg==">AMUW2mXEBAcjgzsdcJ+HpZe+FRe9BA0gWG/NPeU/Us6Ipdsv6P9uxx+ZU1TQtZm50/zq80FhH8B8wDdW+7Gz+BPTQ6RZy+FGLS++Qp1H91JLO8xg5FRzTi8T3yGXC9C2cmi8xQ1AuWHk</go:docsCustomData>
 </go:gDocsCustomXmlDataStorage>
 </file>
 
-<file path=customXml/item2.xml><?xml version="1.0" encoding="utf-8"?>
-<b:Sources xmlns:b="http://schemas.openxmlformats.org/officeDocument/2006/bibliography" xmlns="http://schemas.openxmlformats.org/officeDocument/2006/bibliography" SelectedStyle="\APASixthEditionOfficeOnline.xsl" StyleName="APA" Version="6"/>
+<file path=customXml/itemProps1.xml><?xml version="1.0" encoding="utf-8"?>
+<ds:datastoreItem xmlns:ds="http://schemas.openxmlformats.org/officeDocument/2006/customXml" ds:itemID="{8DC9AD56-43E2-4A12-89D2-621277925F42}">
+  <ds:schemaRefs>
+    <ds:schemaRef ds:uri="http://schemas.openxmlformats.org/officeDocument/2006/bibliography"/>
+  </ds:schemaRefs>
+</ds:datastoreItem>
 </file>
 
-<file path=customXml/itemProps1.xml><?xml version="1.0" encoding="utf-8"?>
+<file path=customXml/itemProps2.xml><?xml version="1.0" encoding="utf-8"?>
 <ds:datastoreItem xmlns:ds="http://schemas.openxmlformats.org/officeDocument/2006/customXml" ds:itemID="{11111111-1234-1234-1234-123412341234}">
   <ds:schemaRefs>
     <ds:schemaRef ds:uri="http://customooxmlschemas.google.com/"/>
     <ds:schemaRef ds:uri="http://schemas.openxmlformats.org/officeDocument/2006/relationships"/>
   </ds:schemaRefs>
 </ds:datastoreItem>
-</file>
-
-<file path=customXml/itemProps2.xml><?xml version="1.0" encoding="utf-8"?>
-<ds:datastoreItem xmlns:ds="http://schemas.openxmlformats.org/officeDocument/2006/customXml" ds:itemID="{8DC9AD56-43E2-4A12-89D2-621277925F42}">
-  <ds:schemaRefs>
-    <ds:schemaRef ds:uri="http://schemas.openxmlformats.org/officeDocument/2006/bibliography"/>
-  </ds:schemaRefs>
-</ds:datastoreItem>
 </file>
</xml_diff>